<commit_message>
report up to design
</commit_message>
<xml_diff>
--- a/Report.docx
+++ b/Report.docx
@@ -4,48 +4,907 @@
   <w:body>
     <w:p>
       <w:pPr>
+        <w:jc w:val="center"/>
         <w:rPr>
           <w:b/>
           <w:bCs/>
-          <w:sz w:val="28"/>
-          <w:szCs w:val="28"/>
+          <w:sz w:val="32"/>
+          <w:szCs w:val="32"/>
         </w:rPr>
       </w:pPr>
       <w:r>
         <w:rPr>
           <w:b/>
           <w:bCs/>
-          <w:sz w:val="28"/>
-          <w:szCs w:val="28"/>
+          <w:sz w:val="32"/>
+          <w:szCs w:val="32"/>
+        </w:rPr>
+        <w:t>RL Replay Analyser: Aggregated Behaviour Analytics for Rocket League Players</w:t>
+      </w:r>
+    </w:p>
+    <w:p>
+      <w:pPr>
+        <w:rPr>
+          <w:b/>
+          <w:bCs/>
+          <w:sz w:val="24"/>
+          <w:szCs w:val="24"/>
+        </w:rPr>
+      </w:pPr>
+      <w:r>
+        <w:rPr>
+          <w:b/>
+          <w:bCs/>
+          <w:sz w:val="24"/>
+          <w:szCs w:val="24"/>
+        </w:rPr>
+        <w:t>Abstract</w:t>
+      </w:r>
+    </w:p>
+    <w:p>
+      <w:r>
+        <w:t>Rocket League players often evaluate performance from individual matches; however, a player’s behaviour can vary heavily match-to-match, which can hide the persistent tendencies a player may have that define their long-term strengths and weaknesses. This project is a web-based analytics system that aggregates replay-derived statistics across many of a user’s games and visualises these tendencies through comparison against teammates/opponents and rank averages, while additionally applying a machine learning classifier to assign them an interpretable playstyle category.</w:t>
+      </w:r>
+    </w:p>
+    <w:p>
+      <w:pPr>
+        <w:rPr>
+          <w:b/>
+          <w:bCs/>
+          <w:sz w:val="24"/>
+          <w:szCs w:val="24"/>
+        </w:rPr>
+      </w:pPr>
+      <w:r>
+        <w:rPr>
+          <w:b/>
+          <w:bCs/>
+          <w:sz w:val="24"/>
+          <w:szCs w:val="24"/>
         </w:rPr>
         <w:t>Motivation</w:t>
       </w:r>
     </w:p>
     <w:p>
       <w:r>
-        <w:t>Rocket League players can vary significantly in how they play game to game, making analysis of individual matches an unreliable way to draw conclusions about a player's overall ability and playstyle. However, when statistics are aggregated across many games, persistent behavioural patterns emerge, patterns that are far more informative since they reflect habits that influence the majority of a player's games. The aim of this project is to provide players a way to visualise these aggregated statistics, compare them against others they have played with or against, and benchmark them against rank averages, in order to gain a clearer picture of their playstyle and identify areas for improvement.</w:t>
-      </w:r>
-    </w:p>
-    <w:p>
-      <w:r>
-        <w:t xml:space="preserve">While tools such as ballchasing.com are already commonly used to allow players to analyse individual game replays in detail, </w:t>
-      </w:r>
-      <w:r>
-        <w:t>there</w:t>
-      </w:r>
-      <w:r>
-        <w:t xml:space="preserve"> is comparatively little focus on persistent behaviour across many games. Currently, the most thorough way to receive this kind of feedback is through hiring a Rocket League coach - an option either inaccessible or excessive for most players. This project offers a far more accessible alternative that, while naturally less in-depth, will prove useful to a broader number of players.</w:t>
-      </w:r>
-    </w:p>
-    <w:p>
-      <w:r>
-        <w:t xml:space="preserve">The players most likely to benefit are those in the middle of the rank distribution, where the majority of players lie. These players have a solid foundational understanding of the </w:t>
-      </w:r>
-      <w:r>
-        <w:t>game but</w:t>
-      </w:r>
-      <w:r>
-        <w:t xml:space="preserve"> often carry habitual flaws in their playstyle that go unnoticed as they compensate for them through their strengths in other areas. By surfacing these tendencies through effective visual comparison, this project aims to help players make targeted improvements, something that simply grinding more games takes far longer to achieve on its own. Beyond raw statistical comparison, the website also applies a machine learning model to classify each player into a broader playstyle category, providing an immediately intuitive characterisation of how they play that raw numbers may struggle to convey.</w:t>
+        <w:t>Rocket League is a fast, high-variance competitive game where individual match outcomes are influenced by many short-term factors (teammate synergy, opponent style, one-off mistakes, kick-off variance, confidence). As a result, conclusions drawn from individually reviewing one or two replays is an unstable method of diagnosing a player's tendencies and flaws. The same player may play a highly defensive game in one match, yet an over-aggressive one in another, despite having a consistently average behaviour across a larger sample.</w:t>
+      </w:r>
+    </w:p>
+    <w:p>
+      <w:r>
+        <w:t xml:space="preserve">Common publicly available tools exist and are excellent for single-game analytics but are weaker at providing the user ways to profile their playstyle. This creates a gap between highly detailed per-match </w:t>
+      </w:r>
+      <w:r>
+        <w:t>breakdowns,</w:t>
+      </w:r>
+      <w:r>
+        <w:t xml:space="preserve"> and the broader, persistent behavioural trends players actually need to improve efficiently. For many players, coaching is the most reliable route to receive this behavioural feedback, however it is not affordable or necessary for most casual-to-serious players. Therefore, I aim to provide an accessible middle ground: automatically aggregated feedback that is derived from statistics and easy to interpret, guiding users into forming their own useful conclusions.</w:t>
+      </w:r>
+    </w:p>
+    <w:p>
+      <w:pPr>
+        <w:rPr>
+          <w:b/>
+          <w:bCs/>
+          <w:sz w:val="26"/>
+          <w:szCs w:val="26"/>
+        </w:rPr>
+      </w:pPr>
+      <w:r>
+        <w:rPr>
+          <w:b/>
+          <w:bCs/>
+          <w:sz w:val="26"/>
+          <w:szCs w:val="26"/>
+        </w:rPr>
+        <w:t>Requirements Capture</w:t>
+      </w:r>
+    </w:p>
+    <w:p>
+      <w:pPr>
+        <w:rPr>
+          <w:b/>
+          <w:bCs/>
+          <w:sz w:val="24"/>
+          <w:szCs w:val="24"/>
+        </w:rPr>
+      </w:pPr>
+      <w:r>
+        <w:rPr>
+          <w:b/>
+          <w:bCs/>
+          <w:sz w:val="24"/>
+          <w:szCs w:val="24"/>
+        </w:rPr>
+        <w:t>Interviews</w:t>
+      </w:r>
+    </w:p>
+    <w:p>
+      <w:r>
+        <w:t>To better understand how players interact with existing analytics tools and how they would characterise different playstyles, I conducted four interviews with Rocket League players of varying skill levels. Full details are contained in Appendix A, with Interview 3 being the most detailed and impactful. The key takeaways were as follows:</w:t>
+      </w:r>
+    </w:p>
+    <w:p>
+      <w:pPr>
+        <w:pStyle w:val="ListParagraph"/>
+        <w:numPr>
+          <w:ilvl w:val="0"/>
+          <w:numId w:val="4"/>
+        </w:numPr>
+      </w:pPr>
+      <w:r>
+        <w:rPr>
+          <w:b/>
+          <w:bCs/>
+        </w:rPr>
+        <w:t xml:space="preserve">Data Overview. </w:t>
+      </w:r>
+      <w:r>
+        <w:t>All interviewees mentioned using "ballchasing.com" as a method of improving, which provides statistics for individual replays in the form of charts. This reinforces the idea that such a section would be useful, aggregating multiple replays rather than individual breakdowns.</w:t>
+      </w:r>
+    </w:p>
+    <w:p>
+      <w:pPr>
+        <w:pStyle w:val="ListParagraph"/>
+        <w:numPr>
+          <w:ilvl w:val="0"/>
+          <w:numId w:val="4"/>
+        </w:numPr>
+      </w:pPr>
+      <w:r>
+        <w:rPr>
+          <w:b/>
+          <w:bCs/>
+        </w:rPr>
+        <w:t xml:space="preserve">Replay Volume. </w:t>
+      </w:r>
+      <w:r>
+        <w:t>An interviewee mentioned that upload limits on ballchasing.com led to less frequent use. By including a built-in parser and not permanently storing replay data server-side, an indefinite number of replays can theoretically be supported, providing larger samples and making behavioural trends easier to identify reliably.</w:t>
+      </w:r>
+    </w:p>
+    <w:p>
+      <w:pPr>
+        <w:pStyle w:val="ListParagraph"/>
+        <w:numPr>
+          <w:ilvl w:val="0"/>
+          <w:numId w:val="4"/>
+        </w:numPr>
+      </w:pPr>
+      <w:r>
+        <w:rPr>
+          <w:b/>
+          <w:bCs/>
+        </w:rPr>
+        <w:t>Comparison to Rank Averages.</w:t>
+      </w:r>
+      <w:r>
+        <w:t xml:space="preserve"> </w:t>
+      </w:r>
+      <w:r>
+        <w:t>An interviewee suggested comparison to average players at certain ranks, additionally suggesting spider diagrams to represent this, allowing users to easily spot outliers in their gameplay that may indicate flaws</w:t>
+      </w:r>
+      <w:r>
+        <w:t>.</w:t>
+      </w:r>
+    </w:p>
+    <w:p>
+      <w:pPr>
+        <w:pStyle w:val="ListParagraph"/>
+        <w:numPr>
+          <w:ilvl w:val="0"/>
+          <w:numId w:val="4"/>
+        </w:numPr>
+      </w:pPr>
+      <w:r>
+        <w:rPr>
+          <w:b/>
+          <w:bCs/>
+        </w:rPr>
+        <w:lastRenderedPageBreak/>
+        <w:t>Playstyle Classification.</w:t>
+      </w:r>
+      <w:r>
+        <w:t xml:space="preserve"> </w:t>
+      </w:r>
+      <w:r>
+        <w:t>Several of the same playstyles were commonly mentioned across interviews with similar characteristics representing each, confirming that a supervised classification approach with manually labelled data would be viable and appropriate</w:t>
+      </w:r>
+      <w:r>
+        <w:t>.</w:t>
+      </w:r>
+    </w:p>
+    <w:p>
+      <w:pPr>
+        <w:rPr>
+          <w:b/>
+          <w:bCs/>
+          <w:sz w:val="24"/>
+          <w:szCs w:val="24"/>
+        </w:rPr>
+      </w:pPr>
+      <w:r>
+        <w:rPr>
+          <w:b/>
+          <w:bCs/>
+          <w:sz w:val="24"/>
+          <w:szCs w:val="24"/>
+        </w:rPr>
+        <w:t>Previous Solutions</w:t>
+      </w:r>
+    </w:p>
+    <w:p>
+      <w:r>
+        <w:t>Alongside the interviews, existing tools were analysed to further inform the requirements.</w:t>
+      </w:r>
+    </w:p>
+    <w:p>
+      <w:r>
+        <w:rPr>
+          <w:b/>
+          <w:bCs/>
+        </w:rPr>
+        <w:t>Ballchasing.com.</w:t>
+      </w:r>
+      <w:r>
+        <w:t xml:space="preserve"> </w:t>
+      </w:r>
+      <w:r>
+        <w:t xml:space="preserve">The main inspiration for this project; a public replay database where players can upload and analyse their replays. Its detailed statistical visualisation will inform my Data Overview section. Notable features include </w:t>
+      </w:r>
+      <w:r>
+        <w:rPr>
+          <w:b/>
+          <w:bCs/>
+        </w:rPr>
+        <w:t>category-based filtering</w:t>
+      </w:r>
+      <w:r>
+        <w:t xml:space="preserve"> to prevent the user being overwhelmed, and abundant use of </w:t>
+      </w:r>
+      <w:r>
+        <w:rPr>
+          <w:b/>
+          <w:bCs/>
+        </w:rPr>
+        <w:t>bar charts</w:t>
+      </w:r>
+      <w:r>
+        <w:t xml:space="preserve"> with clear legends and contrasting colours to provide intuitive player comparisons</w:t>
+      </w:r>
+      <w:r>
+        <w:t>.</w:t>
+      </w:r>
+    </w:p>
+    <w:p>
+      <w:r>
+        <w:rPr>
+          <w:b/>
+          <w:bCs/>
+        </w:rPr>
+        <w:t xml:space="preserve">Rocket League Tracker (rocketleague.tracker.network). </w:t>
+      </w:r>
+      <w:r>
+        <w:t xml:space="preserve">Primarily a rank-tracking site, though it includes useful features such as </w:t>
+      </w:r>
+      <w:r>
+        <w:rPr>
+          <w:b/>
+          <w:bCs/>
+        </w:rPr>
+        <w:t>stacked bar charts</w:t>
+      </w:r>
+      <w:r>
+        <w:t xml:space="preserve"> to represent </w:t>
+      </w:r>
+      <w:r>
+        <w:rPr>
+          <w:b/>
+          <w:bCs/>
+        </w:rPr>
+        <w:t>data ratios</w:t>
+      </w:r>
+      <w:r>
+        <w:t>, which I may use in my Data Overview section. It attempts to visualise playstyle through the ratio of goals, saves, and assists, which I consider insufficient and unindicative of how a player truly plays</w:t>
+      </w:r>
+      <w:r>
+        <w:t>.</w:t>
+      </w:r>
+    </w:p>
+    <w:p>
+      <w:r>
+        <w:rPr>
+          <w:b/>
+          <w:bCs/>
+        </w:rPr>
+        <w:t>Hollow Knight Save Completion Analyzer.</w:t>
+      </w:r>
+      <w:r>
+        <w:t xml:space="preserve"> </w:t>
+      </w:r>
+      <w:r>
+        <w:t xml:space="preserve">Though unrelated to Rocket League, this site parses save files in a similar way to how my system will parse replays. Useful inspiration includes presenting the </w:t>
+      </w:r>
+      <w:r>
+        <w:rPr>
+          <w:b/>
+          <w:bCs/>
+        </w:rPr>
+        <w:t>folder path</w:t>
+      </w:r>
+      <w:r>
+        <w:t xml:space="preserve"> of uploaded files for easy </w:t>
+      </w:r>
+      <w:r>
+        <w:t>copying and</w:t>
+      </w:r>
+      <w:r>
+        <w:t xml:space="preserve"> displaying </w:t>
+      </w:r>
+      <w:r>
+        <w:rPr>
+          <w:b/>
+          <w:bCs/>
+        </w:rPr>
+        <w:t>basic header details</w:t>
+      </w:r>
+      <w:r>
+        <w:t xml:space="preserve"> so the user can confirm correct files were uploaded</w:t>
+      </w:r>
+      <w:r>
+        <w:t>.</w:t>
+      </w:r>
+    </w:p>
+    <w:p>
+      <w:r>
+        <w:t xml:space="preserve">Additional details and evaluations can be found in </w:t>
+      </w:r>
+      <w:r>
+        <w:t>Appendix B</w:t>
+      </w:r>
+      <w:r>
+        <w:t>, or “Analysis/previous solutions.docx”.</w:t>
+      </w:r>
+    </w:p>
+    <w:p>
+      <w:pPr>
+        <w:rPr>
+          <w:b/>
+          <w:bCs/>
+          <w:sz w:val="24"/>
+          <w:szCs w:val="24"/>
+        </w:rPr>
+      </w:pPr>
+      <w:r>
+        <w:rPr>
+          <w:b/>
+          <w:bCs/>
+          <w:sz w:val="24"/>
+          <w:szCs w:val="24"/>
+        </w:rPr>
+        <w:t>List of Requirements</w:t>
+      </w:r>
+    </w:p>
+    <w:p>
+      <w:r>
+        <w:t xml:space="preserve">The most significant, overarching requirements are outlined below. For the full comprehensive list, refer to </w:t>
+      </w:r>
+      <w:r>
+        <w:t>Appendix C</w:t>
+      </w:r>
+      <w:r>
+        <w:t>, or “Analysis/list of requirements.docx”.</w:t>
+      </w:r>
+    </w:p>
+    <w:p>
+      <w:pPr>
+        <w:rPr>
+          <w:b/>
+          <w:bCs/>
+        </w:rPr>
+      </w:pPr>
+      <w:r>
+        <w:rPr>
+          <w:b/>
+          <w:bCs/>
+        </w:rPr>
+        <w:t>Functional Requirements</w:t>
+      </w:r>
+    </w:p>
+    <w:p>
+      <w:r>
+        <w:t>Uploading Replays</w:t>
+      </w:r>
+    </w:p>
+    <w:p>
+      <w:pPr>
+        <w:pStyle w:val="ListParagraph"/>
+        <w:numPr>
+          <w:ilvl w:val="0"/>
+          <w:numId w:val="6"/>
+        </w:numPr>
+      </w:pPr>
+      <w:r>
+        <w:t>Allow the user to upload multiple Rocket League replays</w:t>
+      </w:r>
+      <w:r>
+        <w:t xml:space="preserve"> </w:t>
+      </w:r>
+      <w:r>
+        <w:t>through file upload</w:t>
+      </w:r>
+    </w:p>
+    <w:p>
+      <w:pPr>
+        <w:pStyle w:val="ListParagraph"/>
+        <w:numPr>
+          <w:ilvl w:val="0"/>
+          <w:numId w:val="6"/>
+        </w:numPr>
+      </w:pPr>
+      <w:r>
+        <w:t>Allow users to enter public game ID/URL from ballchasing.com as an alternative</w:t>
+      </w:r>
+    </w:p>
+    <w:p>
+      <w:pPr>
+        <w:pStyle w:val="ListParagraph"/>
+        <w:numPr>
+          <w:ilvl w:val="0"/>
+          <w:numId w:val="6"/>
+        </w:numPr>
+      </w:pPr>
+      <w:r>
+        <w:t>Only allow valid replay files to be uploaded, presenting appropriate error messages otherwise</w:t>
+      </w:r>
+    </w:p>
+    <w:p>
+      <w:pPr>
+        <w:pStyle w:val="ListParagraph"/>
+        <w:numPr>
+          <w:ilvl w:val="0"/>
+          <w:numId w:val="6"/>
+        </w:numPr>
+      </w:pPr>
+      <w:r>
+        <w:t>Parse valid replays in the backend with an appropriate library</w:t>
+      </w:r>
+    </w:p>
+    <w:p>
+      <w:pPr>
+        <w:pStyle w:val="ListParagraph"/>
+        <w:numPr>
+          <w:ilvl w:val="0"/>
+          <w:numId w:val="6"/>
+        </w:numPr>
+      </w:pPr>
+      <w:r>
+        <w:t>Display “header” information for each uploaded replay so user can confirm they are correct</w:t>
+      </w:r>
+    </w:p>
+    <w:p>
+      <w:pPr>
+        <w:pStyle w:val="ListParagraph"/>
+        <w:numPr>
+          <w:ilvl w:val="0"/>
+          <w:numId w:val="6"/>
+        </w:numPr>
+      </w:pPr>
+      <w:r>
+        <w:t xml:space="preserve">Ask </w:t>
+      </w:r>
+      <w:r>
+        <w:t xml:space="preserve">the </w:t>
+      </w:r>
+      <w:r>
+        <w:t>user for basic information to help inform future sections of the system</w:t>
+      </w:r>
+    </w:p>
+    <w:p>
+      <w:r>
+        <w:t>Data Overview</w:t>
+      </w:r>
+    </w:p>
+    <w:p>
+      <w:pPr>
+        <w:pStyle w:val="ListParagraph"/>
+        <w:numPr>
+          <w:ilvl w:val="0"/>
+          <w:numId w:val="7"/>
+        </w:numPr>
+      </w:pPr>
+      <w:r>
+        <w:t>Visualise average of useful gameplay statistics using appropriate charts</w:t>
+      </w:r>
+    </w:p>
+    <w:p>
+      <w:pPr>
+        <w:pStyle w:val="ListParagraph"/>
+        <w:numPr>
+          <w:ilvl w:val="0"/>
+          <w:numId w:val="7"/>
+        </w:numPr>
+      </w:pPr>
+      <w:r>
+        <w:t>Use the average values per teammate and per opponent for informative comparison</w:t>
+      </w:r>
+    </w:p>
+    <w:p>
+      <w:pPr>
+        <w:pStyle w:val="ListParagraph"/>
+        <w:numPr>
+          <w:ilvl w:val="0"/>
+          <w:numId w:val="7"/>
+        </w:numPr>
+      </w:pPr>
+      <w:r>
+        <w:t>Allow filtering between categories of data</w:t>
+      </w:r>
+    </w:p>
+    <w:p>
+      <w:r>
+        <w:t>Playstyle Classification</w:t>
+      </w:r>
+    </w:p>
+    <w:p>
+      <w:pPr>
+        <w:pStyle w:val="ListParagraph"/>
+        <w:numPr>
+          <w:ilvl w:val="0"/>
+          <w:numId w:val="8"/>
+        </w:numPr>
+      </w:pPr>
+      <w:r>
+        <w:t>Use supervised model to classify the user’s playstyle</w:t>
+      </w:r>
+    </w:p>
+    <w:p>
+      <w:pPr>
+        <w:pStyle w:val="ListParagraph"/>
+        <w:numPr>
+          <w:ilvl w:val="0"/>
+          <w:numId w:val="8"/>
+        </w:numPr>
+      </w:pPr>
+      <w:r>
+        <w:t xml:space="preserve">Manually label </w:t>
+      </w:r>
+      <w:r>
+        <w:t>training data</w:t>
+      </w:r>
+    </w:p>
+    <w:p>
+      <w:pPr>
+        <w:pStyle w:val="ListParagraph"/>
+        <w:numPr>
+          <w:ilvl w:val="0"/>
+          <w:numId w:val="8"/>
+        </w:numPr>
+      </w:pPr>
+      <w:r>
+        <w:t xml:space="preserve">Provide model </w:t>
+      </w:r>
+      <w:r>
+        <w:t>confidence</w:t>
+      </w:r>
+      <w:r>
+        <w:t xml:space="preserve"> to show similarity to other playstyles, allowing user to grasp their playstyle as a mixture of all of them, rather than a single label</w:t>
+      </w:r>
+    </w:p>
+    <w:p>
+      <w:pPr>
+        <w:pStyle w:val="ListParagraph"/>
+        <w:numPr>
+          <w:ilvl w:val="0"/>
+          <w:numId w:val="8"/>
+        </w:numPr>
+      </w:pPr>
+      <w:r>
+        <w:lastRenderedPageBreak/>
+        <w:t>Present feature importance metrics</w:t>
+      </w:r>
+      <w:r>
+        <w:t xml:space="preserve"> to give </w:t>
+      </w:r>
+      <w:r>
+        <w:t>user insight into which aspects of their gameplay drove the classification</w:t>
+      </w:r>
+    </w:p>
+    <w:p>
+      <w:pPr>
+        <w:pStyle w:val="ListParagraph"/>
+        <w:numPr>
+          <w:ilvl w:val="0"/>
+          <w:numId w:val="8"/>
+        </w:numPr>
+      </w:pPr>
+      <w:r>
+        <w:t>Give general advice using suggestions from interviews</w:t>
+      </w:r>
+    </w:p>
+    <w:p>
+      <w:r>
+        <w:t>Rank Comparison</w:t>
+      </w:r>
+    </w:p>
+    <w:p>
+      <w:pPr>
+        <w:pStyle w:val="ListParagraph"/>
+        <w:numPr>
+          <w:ilvl w:val="0"/>
+          <w:numId w:val="9"/>
+        </w:numPr>
+      </w:pPr>
+      <w:r>
+        <w:t>Compare the user's averaged statistics with average values of their rank and any other rank</w:t>
+      </w:r>
+    </w:p>
+    <w:p>
+      <w:pPr>
+        <w:pStyle w:val="ListParagraph"/>
+        <w:numPr>
+          <w:ilvl w:val="0"/>
+          <w:numId w:val="9"/>
+        </w:numPr>
+      </w:pPr>
+      <w:r>
+        <w:t>Highlight user’s statistics that are outliers in comparison to their rank’s average values</w:t>
+      </w:r>
+    </w:p>
+    <w:p>
+      <w:pPr>
+        <w:pStyle w:val="ListParagraph"/>
+        <w:numPr>
+          <w:ilvl w:val="0"/>
+          <w:numId w:val="9"/>
+        </w:numPr>
+      </w:pPr>
+      <w:r>
+        <w:t xml:space="preserve">Visualise </w:t>
+      </w:r>
+      <w:r>
+        <w:t>comparisons</w:t>
+      </w:r>
+      <w:r>
+        <w:t xml:space="preserve"> using spider charts</w:t>
+      </w:r>
+    </w:p>
+    <w:p>
+      <w:pPr>
+        <w:pStyle w:val="ListParagraph"/>
+        <w:numPr>
+          <w:ilvl w:val="0"/>
+          <w:numId w:val="9"/>
+        </w:numPr>
+      </w:pPr>
+      <w:r>
+        <w:t>Source</w:t>
+      </w:r>
+      <w:r>
+        <w:t xml:space="preserve"> data from large, pre-computed dataset to avoid </w:t>
+      </w:r>
+      <w:r>
+        <w:t>repeated API calls</w:t>
+      </w:r>
+    </w:p>
+    <w:p>
+      <w:pPr>
+        <w:rPr>
+          <w:b/>
+          <w:bCs/>
+        </w:rPr>
+      </w:pPr>
+      <w:r>
+        <w:rPr>
+          <w:b/>
+          <w:bCs/>
+        </w:rPr>
+        <w:t>Non-Functional Requirements</w:t>
+      </w:r>
+    </w:p>
+    <w:p>
+      <w:r>
+        <w:t>User Interface</w:t>
+      </w:r>
+    </w:p>
+    <w:p>
+      <w:pPr>
+        <w:pStyle w:val="ListParagraph"/>
+        <w:numPr>
+          <w:ilvl w:val="0"/>
+          <w:numId w:val="11"/>
+        </w:numPr>
+      </w:pPr>
+      <w:r>
+        <w:t>Intuitive, responsive, and clear interface, with consistent and contrasting colours, adequate spacing, and clearly labelled charts</w:t>
+      </w:r>
+    </w:p>
+    <w:p>
+      <w:pPr>
+        <w:pStyle w:val="ListParagraph"/>
+        <w:numPr>
+          <w:ilvl w:val="0"/>
+          <w:numId w:val="11"/>
+        </w:numPr>
+      </w:pPr>
+      <w:r>
+        <w:t>Outliers in the Rank Comparison section highlighted with contrasting colours</w:t>
+      </w:r>
+    </w:p>
+    <w:p>
+      <w:pPr>
+        <w:pStyle w:val="ListParagraph"/>
+        <w:numPr>
+          <w:ilvl w:val="0"/>
+          <w:numId w:val="11"/>
+        </w:numPr>
+      </w:pPr>
+      <w:r>
+        <w:t>Progress visualisation, such as a loading bar, for longer tasks</w:t>
+      </w:r>
+    </w:p>
+    <w:p>
+      <w:r>
+        <w:t>Performance</w:t>
+      </w:r>
+    </w:p>
+    <w:p>
+      <w:pPr>
+        <w:pStyle w:val="ListParagraph"/>
+        <w:numPr>
+          <w:ilvl w:val="0"/>
+          <w:numId w:val="12"/>
+        </w:numPr>
+      </w:pPr>
+      <w:r>
+        <w:t>Support large batches of replays with an average loading time of under 2–3 seconds per replay</w:t>
+      </w:r>
+    </w:p>
+    <w:p>
+      <w:pPr>
+        <w:pStyle w:val="ListParagraph"/>
+        <w:numPr>
+          <w:ilvl w:val="0"/>
+          <w:numId w:val="12"/>
+        </w:numPr>
+      </w:pPr>
+      <w:r>
+        <w:t>Use pre-computed dataset for quicker rank comparison loading</w:t>
+      </w:r>
+    </w:p>
+    <w:p>
+      <w:pPr>
+        <w:pStyle w:val="ListParagraph"/>
+        <w:numPr>
+          <w:ilvl w:val="0"/>
+          <w:numId w:val="12"/>
+        </w:numPr>
+      </w:pPr>
+      <w:r>
+        <w:t>Cache parsed data for quicker repeated computation</w:t>
+      </w:r>
+    </w:p>
+    <w:p>
+      <w:r>
+        <w:t>Accuracy</w:t>
+      </w:r>
+    </w:p>
+    <w:p>
+      <w:pPr>
+        <w:pStyle w:val="ListParagraph"/>
+        <w:numPr>
+          <w:ilvl w:val="0"/>
+          <w:numId w:val="8"/>
+        </w:numPr>
+      </w:pPr>
+      <w:r>
+        <w:t xml:space="preserve">Use carefully </w:t>
+      </w:r>
+      <w:r>
+        <w:t>selected</w:t>
+      </w:r>
+      <w:r>
+        <w:t xml:space="preserve"> features to train the model for high accuracy and lower noise</w:t>
+      </w:r>
+    </w:p>
+    <w:p>
+      <w:pPr>
+        <w:pStyle w:val="ListParagraph"/>
+        <w:numPr>
+          <w:ilvl w:val="0"/>
+          <w:numId w:val="8"/>
+        </w:numPr>
+      </w:pPr>
+      <w:r>
+        <w:t xml:space="preserve">Test models using standard methods to ensure sufficient accuracy (75%+ </w:t>
+      </w:r>
+      <w:r>
+        <w:t xml:space="preserve">given the </w:t>
+      </w:r>
+      <w:r>
+        <w:t xml:space="preserve">subjective nature of </w:t>
+      </w:r>
+      <w:r>
+        <w:t xml:space="preserve">playstyle </w:t>
+      </w:r>
+      <w:r>
+        <w:t>classification)</w:t>
+      </w:r>
+    </w:p>
+    <w:p>
+      <w:pPr>
+        <w:pStyle w:val="ListParagraph"/>
+        <w:numPr>
+          <w:ilvl w:val="0"/>
+          <w:numId w:val="8"/>
+        </w:numPr>
+      </w:pPr>
+      <w:r>
+        <w:t>Use recent data to ensure comparisons and models reflect today's standards across ranks</w:t>
+      </w:r>
+    </w:p>
+    <w:p>
+      <w:r>
+        <w:t>Reliability and Security</w:t>
+      </w:r>
+    </w:p>
+    <w:p>
+      <w:pPr>
+        <w:pStyle w:val="ListParagraph"/>
+        <w:numPr>
+          <w:ilvl w:val="0"/>
+          <w:numId w:val="14"/>
+        </w:numPr>
+      </w:pPr>
+      <w:r>
+        <w:t xml:space="preserve">Error handling keeps the site </w:t>
+      </w:r>
+      <w:r>
+        <w:t>responsive,</w:t>
+      </w:r>
+      <w:r>
+        <w:t xml:space="preserve"> if possible</w:t>
+      </w:r>
+      <w:r>
+        <w:t>, with suitable error messages otherwise</w:t>
+      </w:r>
+    </w:p>
+    <w:p>
+      <w:pPr>
+        <w:pStyle w:val="ListParagraph"/>
+        <w:numPr>
+          <w:ilvl w:val="0"/>
+          <w:numId w:val="14"/>
+        </w:numPr>
+      </w:pPr>
+      <w:r>
+        <w:t xml:space="preserve">User’s data is only processed, </w:t>
+      </w:r>
+      <w:r>
+        <w:t>never stored server-side</w:t>
+      </w:r>
+    </w:p>
+    <w:p>
+      <w:r>
+        <w:t>The following section will describe the design decisions made to satisfy these requirements.</w:t>
+      </w:r>
+    </w:p>
+    <w:p>
+      <w:pPr>
+        <w:rPr>
+          <w:b/>
+          <w:bCs/>
+          <w:sz w:val="26"/>
+          <w:szCs w:val="26"/>
+        </w:rPr>
+      </w:pPr>
+      <w:r>
+        <w:rPr>
+          <w:b/>
+          <w:bCs/>
+          <w:sz w:val="26"/>
+          <w:szCs w:val="26"/>
+        </w:rPr>
+        <w:t>Design</w:t>
       </w:r>
     </w:p>
     <w:sectPr>
@@ -56,6 +915,1724 @@
     </w:sectPr>
   </w:body>
 </w:document>
+</file>
+
+<file path=word/numbering.xml><?xml version="1.0" encoding="utf-8"?>
+<w:numbering xmlns:wpc="http://schemas.microsoft.com/office/word/2010/wordprocessingCanvas" xmlns:cx="http://schemas.microsoft.com/office/drawing/2014/chartex" xmlns:cx1="http://schemas.microsoft.com/office/drawing/2015/9/8/chartex" xmlns:cx2="http://schemas.microsoft.com/office/drawing/2015/10/21/chartex" xmlns:cx3="http://schemas.microsoft.com/office/drawing/2016/5/9/chartex" xmlns:cx4="http://schemas.microsoft.com/office/drawing/2016/5/10/chartex" xmlns:cx5="http://schemas.microsoft.com/office/drawing/2016/5/11/chartex" xmlns:cx6="http://schemas.microsoft.com/office/drawing/2016/5/12/chartex" xmlns:cx7="http://schemas.microsoft.com/office/drawing/2016/5/13/chartex" xmlns:cx8="http://schemas.microsoft.com/office/drawing/2016/5/14/chartex" xmlns:mc="http://schemas.openxmlformats.org/markup-compatibility/2006" xmlns:aink="http://schemas.microsoft.com/office/drawing/2016/ink" xmlns:am3d="http://schemas.microsoft.com/office/drawing/2017/model3d" xmlns:o="urn:schemas-microsoft-com:office:office" xmlns:oel="http://schemas.microsoft.com/office/2019/extlst" xmlns:r="http://schemas.openxmlformats.org/officeDocument/2006/relationships" xmlns:m="http://schemas.openxmlformats.org/officeDocument/2006/math" xmlns:v="urn:schemas-microsoft-com:vml" xmlns:wp14="http://schemas.microsoft.com/office/word/2010/wordprocessingDrawing" xmlns:wp="http://schemas.openxmlformats.org/drawingml/2006/wordprocessingDrawing" xmlns:w10="urn:schemas-microsoft-com:office:word" xmlns:w="http://schemas.openxmlformats.org/wordprocessingml/2006/main" xmlns:w14="http://schemas.microsoft.com/office/word/2010/wordml" xmlns:w15="http://schemas.microsoft.com/office/word/2012/wordml" xmlns:w16cex="http://schemas.microsoft.com/office/word/2018/wordml/cex" xmlns:w16cid="http://schemas.microsoft.com/office/word/2016/wordml/cid" xmlns:w16="http://schemas.microsoft.com/office/word/2018/wordml" xmlns:w16du="http://schemas.microsoft.com/office/word/2023/wordml/word16du" xmlns:w16sdtdh="http://schemas.microsoft.com/office/word/2020/wordml/sdtdatahash" xmlns:w16sdtfl="http://schemas.microsoft.com/office/word/2024/wordml/sdtformatlock" xmlns:w16se="http://schemas.microsoft.com/office/word/2015/wordml/symex" xmlns:wpg="http://schemas.microsoft.com/office/word/2010/wordprocessingGroup" xmlns:wpi="http://schemas.microsoft.com/office/word/2010/wordprocessingInk" xmlns:wne="http://schemas.microsoft.com/office/word/2006/wordml" xmlns:wps="http://schemas.microsoft.com/office/word/2010/wordprocessingShape" mc:Ignorable="w14 w15 w16se w16cid w16 w16cex w16sdtdh w16sdtfl w16du wp14">
+  <w:abstractNum w:abstractNumId="0" w15:restartNumberingAfterBreak="0">
+    <w:nsid w:val="06E409BE"/>
+    <w:multiLevelType w:val="hybridMultilevel"/>
+    <w:tmpl w:val="0322AA20"/>
+    <w:lvl w:ilvl="0" w:tplc="08090001">
+      <w:start w:val="1"/>
+      <w:numFmt w:val="bullet"/>
+      <w:lvlText w:val=""/>
+      <w:lvlJc w:val="left"/>
+      <w:pPr>
+        <w:ind w:left="360" w:hanging="360"/>
+      </w:pPr>
+      <w:rPr>
+        <w:rFonts w:ascii="Symbol" w:hAnsi="Symbol" w:hint="default"/>
+      </w:rPr>
+    </w:lvl>
+    <w:lvl w:ilvl="1" w:tplc="08090003" w:tentative="1">
+      <w:start w:val="1"/>
+      <w:numFmt w:val="bullet"/>
+      <w:lvlText w:val="o"/>
+      <w:lvlJc w:val="left"/>
+      <w:pPr>
+        <w:ind w:left="1080" w:hanging="360"/>
+      </w:pPr>
+      <w:rPr>
+        <w:rFonts w:ascii="Courier New" w:hAnsi="Courier New" w:cs="Courier New" w:hint="default"/>
+      </w:rPr>
+    </w:lvl>
+    <w:lvl w:ilvl="2" w:tplc="08090005" w:tentative="1">
+      <w:start w:val="1"/>
+      <w:numFmt w:val="bullet"/>
+      <w:lvlText w:val=""/>
+      <w:lvlJc w:val="left"/>
+      <w:pPr>
+        <w:ind w:left="1800" w:hanging="360"/>
+      </w:pPr>
+      <w:rPr>
+        <w:rFonts w:ascii="Wingdings" w:hAnsi="Wingdings" w:hint="default"/>
+      </w:rPr>
+    </w:lvl>
+    <w:lvl w:ilvl="3" w:tplc="08090001" w:tentative="1">
+      <w:start w:val="1"/>
+      <w:numFmt w:val="bullet"/>
+      <w:lvlText w:val=""/>
+      <w:lvlJc w:val="left"/>
+      <w:pPr>
+        <w:ind w:left="2520" w:hanging="360"/>
+      </w:pPr>
+      <w:rPr>
+        <w:rFonts w:ascii="Symbol" w:hAnsi="Symbol" w:hint="default"/>
+      </w:rPr>
+    </w:lvl>
+    <w:lvl w:ilvl="4" w:tplc="08090003" w:tentative="1">
+      <w:start w:val="1"/>
+      <w:numFmt w:val="bullet"/>
+      <w:lvlText w:val="o"/>
+      <w:lvlJc w:val="left"/>
+      <w:pPr>
+        <w:ind w:left="3240" w:hanging="360"/>
+      </w:pPr>
+      <w:rPr>
+        <w:rFonts w:ascii="Courier New" w:hAnsi="Courier New" w:cs="Courier New" w:hint="default"/>
+      </w:rPr>
+    </w:lvl>
+    <w:lvl w:ilvl="5" w:tplc="08090005" w:tentative="1">
+      <w:start w:val="1"/>
+      <w:numFmt w:val="bullet"/>
+      <w:lvlText w:val=""/>
+      <w:lvlJc w:val="left"/>
+      <w:pPr>
+        <w:ind w:left="3960" w:hanging="360"/>
+      </w:pPr>
+      <w:rPr>
+        <w:rFonts w:ascii="Wingdings" w:hAnsi="Wingdings" w:hint="default"/>
+      </w:rPr>
+    </w:lvl>
+    <w:lvl w:ilvl="6" w:tplc="08090001" w:tentative="1">
+      <w:start w:val="1"/>
+      <w:numFmt w:val="bullet"/>
+      <w:lvlText w:val=""/>
+      <w:lvlJc w:val="left"/>
+      <w:pPr>
+        <w:ind w:left="4680" w:hanging="360"/>
+      </w:pPr>
+      <w:rPr>
+        <w:rFonts w:ascii="Symbol" w:hAnsi="Symbol" w:hint="default"/>
+      </w:rPr>
+    </w:lvl>
+    <w:lvl w:ilvl="7" w:tplc="08090003" w:tentative="1">
+      <w:start w:val="1"/>
+      <w:numFmt w:val="bullet"/>
+      <w:lvlText w:val="o"/>
+      <w:lvlJc w:val="left"/>
+      <w:pPr>
+        <w:ind w:left="5400" w:hanging="360"/>
+      </w:pPr>
+      <w:rPr>
+        <w:rFonts w:ascii="Courier New" w:hAnsi="Courier New" w:cs="Courier New" w:hint="default"/>
+      </w:rPr>
+    </w:lvl>
+    <w:lvl w:ilvl="8" w:tplc="08090005" w:tentative="1">
+      <w:start w:val="1"/>
+      <w:numFmt w:val="bullet"/>
+      <w:lvlText w:val=""/>
+      <w:lvlJc w:val="left"/>
+      <w:pPr>
+        <w:ind w:left="6120" w:hanging="360"/>
+      </w:pPr>
+      <w:rPr>
+        <w:rFonts w:ascii="Wingdings" w:hAnsi="Wingdings" w:hint="default"/>
+      </w:rPr>
+    </w:lvl>
+  </w:abstractNum>
+  <w:abstractNum w:abstractNumId="1" w15:restartNumberingAfterBreak="0">
+    <w:nsid w:val="106F3735"/>
+    <w:multiLevelType w:val="hybridMultilevel"/>
+    <w:tmpl w:val="74A20B1E"/>
+    <w:lvl w:ilvl="0" w:tplc="08090001">
+      <w:start w:val="1"/>
+      <w:numFmt w:val="bullet"/>
+      <w:lvlText w:val=""/>
+      <w:lvlJc w:val="left"/>
+      <w:pPr>
+        <w:ind w:left="360" w:hanging="360"/>
+      </w:pPr>
+      <w:rPr>
+        <w:rFonts w:ascii="Symbol" w:hAnsi="Symbol" w:hint="default"/>
+      </w:rPr>
+    </w:lvl>
+    <w:lvl w:ilvl="1" w:tplc="08090003" w:tentative="1">
+      <w:start w:val="1"/>
+      <w:numFmt w:val="bullet"/>
+      <w:lvlText w:val="o"/>
+      <w:lvlJc w:val="left"/>
+      <w:pPr>
+        <w:ind w:left="1080" w:hanging="360"/>
+      </w:pPr>
+      <w:rPr>
+        <w:rFonts w:ascii="Courier New" w:hAnsi="Courier New" w:cs="Courier New" w:hint="default"/>
+      </w:rPr>
+    </w:lvl>
+    <w:lvl w:ilvl="2" w:tplc="08090005" w:tentative="1">
+      <w:start w:val="1"/>
+      <w:numFmt w:val="bullet"/>
+      <w:lvlText w:val=""/>
+      <w:lvlJc w:val="left"/>
+      <w:pPr>
+        <w:ind w:left="1800" w:hanging="360"/>
+      </w:pPr>
+      <w:rPr>
+        <w:rFonts w:ascii="Wingdings" w:hAnsi="Wingdings" w:hint="default"/>
+      </w:rPr>
+    </w:lvl>
+    <w:lvl w:ilvl="3" w:tplc="08090001" w:tentative="1">
+      <w:start w:val="1"/>
+      <w:numFmt w:val="bullet"/>
+      <w:lvlText w:val=""/>
+      <w:lvlJc w:val="left"/>
+      <w:pPr>
+        <w:ind w:left="2520" w:hanging="360"/>
+      </w:pPr>
+      <w:rPr>
+        <w:rFonts w:ascii="Symbol" w:hAnsi="Symbol" w:hint="default"/>
+      </w:rPr>
+    </w:lvl>
+    <w:lvl w:ilvl="4" w:tplc="08090003" w:tentative="1">
+      <w:start w:val="1"/>
+      <w:numFmt w:val="bullet"/>
+      <w:lvlText w:val="o"/>
+      <w:lvlJc w:val="left"/>
+      <w:pPr>
+        <w:ind w:left="3240" w:hanging="360"/>
+      </w:pPr>
+      <w:rPr>
+        <w:rFonts w:ascii="Courier New" w:hAnsi="Courier New" w:cs="Courier New" w:hint="default"/>
+      </w:rPr>
+    </w:lvl>
+    <w:lvl w:ilvl="5" w:tplc="08090005" w:tentative="1">
+      <w:start w:val="1"/>
+      <w:numFmt w:val="bullet"/>
+      <w:lvlText w:val=""/>
+      <w:lvlJc w:val="left"/>
+      <w:pPr>
+        <w:ind w:left="3960" w:hanging="360"/>
+      </w:pPr>
+      <w:rPr>
+        <w:rFonts w:ascii="Wingdings" w:hAnsi="Wingdings" w:hint="default"/>
+      </w:rPr>
+    </w:lvl>
+    <w:lvl w:ilvl="6" w:tplc="08090001" w:tentative="1">
+      <w:start w:val="1"/>
+      <w:numFmt w:val="bullet"/>
+      <w:lvlText w:val=""/>
+      <w:lvlJc w:val="left"/>
+      <w:pPr>
+        <w:ind w:left="4680" w:hanging="360"/>
+      </w:pPr>
+      <w:rPr>
+        <w:rFonts w:ascii="Symbol" w:hAnsi="Symbol" w:hint="default"/>
+      </w:rPr>
+    </w:lvl>
+    <w:lvl w:ilvl="7" w:tplc="08090003" w:tentative="1">
+      <w:start w:val="1"/>
+      <w:numFmt w:val="bullet"/>
+      <w:lvlText w:val="o"/>
+      <w:lvlJc w:val="left"/>
+      <w:pPr>
+        <w:ind w:left="5400" w:hanging="360"/>
+      </w:pPr>
+      <w:rPr>
+        <w:rFonts w:ascii="Courier New" w:hAnsi="Courier New" w:cs="Courier New" w:hint="default"/>
+      </w:rPr>
+    </w:lvl>
+    <w:lvl w:ilvl="8" w:tplc="08090005" w:tentative="1">
+      <w:start w:val="1"/>
+      <w:numFmt w:val="bullet"/>
+      <w:lvlText w:val=""/>
+      <w:lvlJc w:val="left"/>
+      <w:pPr>
+        <w:ind w:left="6120" w:hanging="360"/>
+      </w:pPr>
+      <w:rPr>
+        <w:rFonts w:ascii="Wingdings" w:hAnsi="Wingdings" w:hint="default"/>
+      </w:rPr>
+    </w:lvl>
+  </w:abstractNum>
+  <w:abstractNum w:abstractNumId="2" w15:restartNumberingAfterBreak="0">
+    <w:nsid w:val="12DC3E06"/>
+    <w:multiLevelType w:val="hybridMultilevel"/>
+    <w:tmpl w:val="7868C090"/>
+    <w:lvl w:ilvl="0" w:tplc="08090001">
+      <w:start w:val="1"/>
+      <w:numFmt w:val="bullet"/>
+      <w:lvlText w:val=""/>
+      <w:lvlJc w:val="left"/>
+      <w:pPr>
+        <w:ind w:left="360" w:hanging="360"/>
+      </w:pPr>
+      <w:rPr>
+        <w:rFonts w:ascii="Symbol" w:hAnsi="Symbol" w:hint="default"/>
+      </w:rPr>
+    </w:lvl>
+    <w:lvl w:ilvl="1" w:tplc="08090003" w:tentative="1">
+      <w:start w:val="1"/>
+      <w:numFmt w:val="bullet"/>
+      <w:lvlText w:val="o"/>
+      <w:lvlJc w:val="left"/>
+      <w:pPr>
+        <w:ind w:left="1080" w:hanging="360"/>
+      </w:pPr>
+      <w:rPr>
+        <w:rFonts w:ascii="Courier New" w:hAnsi="Courier New" w:cs="Courier New" w:hint="default"/>
+      </w:rPr>
+    </w:lvl>
+    <w:lvl w:ilvl="2" w:tplc="08090005" w:tentative="1">
+      <w:start w:val="1"/>
+      <w:numFmt w:val="bullet"/>
+      <w:lvlText w:val=""/>
+      <w:lvlJc w:val="left"/>
+      <w:pPr>
+        <w:ind w:left="1800" w:hanging="360"/>
+      </w:pPr>
+      <w:rPr>
+        <w:rFonts w:ascii="Wingdings" w:hAnsi="Wingdings" w:hint="default"/>
+      </w:rPr>
+    </w:lvl>
+    <w:lvl w:ilvl="3" w:tplc="08090001" w:tentative="1">
+      <w:start w:val="1"/>
+      <w:numFmt w:val="bullet"/>
+      <w:lvlText w:val=""/>
+      <w:lvlJc w:val="left"/>
+      <w:pPr>
+        <w:ind w:left="2520" w:hanging="360"/>
+      </w:pPr>
+      <w:rPr>
+        <w:rFonts w:ascii="Symbol" w:hAnsi="Symbol" w:hint="default"/>
+      </w:rPr>
+    </w:lvl>
+    <w:lvl w:ilvl="4" w:tplc="08090003" w:tentative="1">
+      <w:start w:val="1"/>
+      <w:numFmt w:val="bullet"/>
+      <w:lvlText w:val="o"/>
+      <w:lvlJc w:val="left"/>
+      <w:pPr>
+        <w:ind w:left="3240" w:hanging="360"/>
+      </w:pPr>
+      <w:rPr>
+        <w:rFonts w:ascii="Courier New" w:hAnsi="Courier New" w:cs="Courier New" w:hint="default"/>
+      </w:rPr>
+    </w:lvl>
+    <w:lvl w:ilvl="5" w:tplc="08090005" w:tentative="1">
+      <w:start w:val="1"/>
+      <w:numFmt w:val="bullet"/>
+      <w:lvlText w:val=""/>
+      <w:lvlJc w:val="left"/>
+      <w:pPr>
+        <w:ind w:left="3960" w:hanging="360"/>
+      </w:pPr>
+      <w:rPr>
+        <w:rFonts w:ascii="Wingdings" w:hAnsi="Wingdings" w:hint="default"/>
+      </w:rPr>
+    </w:lvl>
+    <w:lvl w:ilvl="6" w:tplc="08090001" w:tentative="1">
+      <w:start w:val="1"/>
+      <w:numFmt w:val="bullet"/>
+      <w:lvlText w:val=""/>
+      <w:lvlJc w:val="left"/>
+      <w:pPr>
+        <w:ind w:left="4680" w:hanging="360"/>
+      </w:pPr>
+      <w:rPr>
+        <w:rFonts w:ascii="Symbol" w:hAnsi="Symbol" w:hint="default"/>
+      </w:rPr>
+    </w:lvl>
+    <w:lvl w:ilvl="7" w:tplc="08090003" w:tentative="1">
+      <w:start w:val="1"/>
+      <w:numFmt w:val="bullet"/>
+      <w:lvlText w:val="o"/>
+      <w:lvlJc w:val="left"/>
+      <w:pPr>
+        <w:ind w:left="5400" w:hanging="360"/>
+      </w:pPr>
+      <w:rPr>
+        <w:rFonts w:ascii="Courier New" w:hAnsi="Courier New" w:cs="Courier New" w:hint="default"/>
+      </w:rPr>
+    </w:lvl>
+    <w:lvl w:ilvl="8" w:tplc="08090005" w:tentative="1">
+      <w:start w:val="1"/>
+      <w:numFmt w:val="bullet"/>
+      <w:lvlText w:val=""/>
+      <w:lvlJc w:val="left"/>
+      <w:pPr>
+        <w:ind w:left="6120" w:hanging="360"/>
+      </w:pPr>
+      <w:rPr>
+        <w:rFonts w:ascii="Wingdings" w:hAnsi="Wingdings" w:hint="default"/>
+      </w:rPr>
+    </w:lvl>
+  </w:abstractNum>
+  <w:abstractNum w:abstractNumId="3" w15:restartNumberingAfterBreak="0">
+    <w:nsid w:val="13DE6A7A"/>
+    <w:multiLevelType w:val="hybridMultilevel"/>
+    <w:tmpl w:val="43E40DF6"/>
+    <w:lvl w:ilvl="0" w:tplc="08090001">
+      <w:start w:val="1"/>
+      <w:numFmt w:val="bullet"/>
+      <w:lvlText w:val=""/>
+      <w:lvlJc w:val="left"/>
+      <w:pPr>
+        <w:ind w:left="720" w:hanging="360"/>
+      </w:pPr>
+      <w:rPr>
+        <w:rFonts w:ascii="Symbol" w:hAnsi="Symbol" w:hint="default"/>
+      </w:rPr>
+    </w:lvl>
+    <w:lvl w:ilvl="1" w:tplc="08090003" w:tentative="1">
+      <w:start w:val="1"/>
+      <w:numFmt w:val="bullet"/>
+      <w:lvlText w:val="o"/>
+      <w:lvlJc w:val="left"/>
+      <w:pPr>
+        <w:ind w:left="1440" w:hanging="360"/>
+      </w:pPr>
+      <w:rPr>
+        <w:rFonts w:ascii="Courier New" w:hAnsi="Courier New" w:cs="Courier New" w:hint="default"/>
+      </w:rPr>
+    </w:lvl>
+    <w:lvl w:ilvl="2" w:tplc="08090005" w:tentative="1">
+      <w:start w:val="1"/>
+      <w:numFmt w:val="bullet"/>
+      <w:lvlText w:val=""/>
+      <w:lvlJc w:val="left"/>
+      <w:pPr>
+        <w:ind w:left="2160" w:hanging="360"/>
+      </w:pPr>
+      <w:rPr>
+        <w:rFonts w:ascii="Wingdings" w:hAnsi="Wingdings" w:hint="default"/>
+      </w:rPr>
+    </w:lvl>
+    <w:lvl w:ilvl="3" w:tplc="08090001" w:tentative="1">
+      <w:start w:val="1"/>
+      <w:numFmt w:val="bullet"/>
+      <w:lvlText w:val=""/>
+      <w:lvlJc w:val="left"/>
+      <w:pPr>
+        <w:ind w:left="2880" w:hanging="360"/>
+      </w:pPr>
+      <w:rPr>
+        <w:rFonts w:ascii="Symbol" w:hAnsi="Symbol" w:hint="default"/>
+      </w:rPr>
+    </w:lvl>
+    <w:lvl w:ilvl="4" w:tplc="08090003" w:tentative="1">
+      <w:start w:val="1"/>
+      <w:numFmt w:val="bullet"/>
+      <w:lvlText w:val="o"/>
+      <w:lvlJc w:val="left"/>
+      <w:pPr>
+        <w:ind w:left="3600" w:hanging="360"/>
+      </w:pPr>
+      <w:rPr>
+        <w:rFonts w:ascii="Courier New" w:hAnsi="Courier New" w:cs="Courier New" w:hint="default"/>
+      </w:rPr>
+    </w:lvl>
+    <w:lvl w:ilvl="5" w:tplc="08090005" w:tentative="1">
+      <w:start w:val="1"/>
+      <w:numFmt w:val="bullet"/>
+      <w:lvlText w:val=""/>
+      <w:lvlJc w:val="left"/>
+      <w:pPr>
+        <w:ind w:left="4320" w:hanging="360"/>
+      </w:pPr>
+      <w:rPr>
+        <w:rFonts w:ascii="Wingdings" w:hAnsi="Wingdings" w:hint="default"/>
+      </w:rPr>
+    </w:lvl>
+    <w:lvl w:ilvl="6" w:tplc="08090001" w:tentative="1">
+      <w:start w:val="1"/>
+      <w:numFmt w:val="bullet"/>
+      <w:lvlText w:val=""/>
+      <w:lvlJc w:val="left"/>
+      <w:pPr>
+        <w:ind w:left="5040" w:hanging="360"/>
+      </w:pPr>
+      <w:rPr>
+        <w:rFonts w:ascii="Symbol" w:hAnsi="Symbol" w:hint="default"/>
+      </w:rPr>
+    </w:lvl>
+    <w:lvl w:ilvl="7" w:tplc="08090003" w:tentative="1">
+      <w:start w:val="1"/>
+      <w:numFmt w:val="bullet"/>
+      <w:lvlText w:val="o"/>
+      <w:lvlJc w:val="left"/>
+      <w:pPr>
+        <w:ind w:left="5760" w:hanging="360"/>
+      </w:pPr>
+      <w:rPr>
+        <w:rFonts w:ascii="Courier New" w:hAnsi="Courier New" w:cs="Courier New" w:hint="default"/>
+      </w:rPr>
+    </w:lvl>
+    <w:lvl w:ilvl="8" w:tplc="08090005" w:tentative="1">
+      <w:start w:val="1"/>
+      <w:numFmt w:val="bullet"/>
+      <w:lvlText w:val=""/>
+      <w:lvlJc w:val="left"/>
+      <w:pPr>
+        <w:ind w:left="6480" w:hanging="360"/>
+      </w:pPr>
+      <w:rPr>
+        <w:rFonts w:ascii="Wingdings" w:hAnsi="Wingdings" w:hint="default"/>
+      </w:rPr>
+    </w:lvl>
+  </w:abstractNum>
+  <w:abstractNum w:abstractNumId="4" w15:restartNumberingAfterBreak="0">
+    <w:nsid w:val="160C08E8"/>
+    <w:multiLevelType w:val="hybridMultilevel"/>
+    <w:tmpl w:val="D58E5D2A"/>
+    <w:lvl w:ilvl="0" w:tplc="0809000F">
+      <w:start w:val="1"/>
+      <w:numFmt w:val="decimal"/>
+      <w:lvlText w:val="%1."/>
+      <w:lvlJc w:val="left"/>
+      <w:pPr>
+        <w:ind w:left="765" w:hanging="360"/>
+      </w:pPr>
+    </w:lvl>
+    <w:lvl w:ilvl="1" w:tplc="08090019" w:tentative="1">
+      <w:start w:val="1"/>
+      <w:numFmt w:val="lowerLetter"/>
+      <w:lvlText w:val="%2."/>
+      <w:lvlJc w:val="left"/>
+      <w:pPr>
+        <w:ind w:left="1485" w:hanging="360"/>
+      </w:pPr>
+    </w:lvl>
+    <w:lvl w:ilvl="2" w:tplc="0809001B" w:tentative="1">
+      <w:start w:val="1"/>
+      <w:numFmt w:val="lowerRoman"/>
+      <w:lvlText w:val="%3."/>
+      <w:lvlJc w:val="right"/>
+      <w:pPr>
+        <w:ind w:left="2205" w:hanging="180"/>
+      </w:pPr>
+    </w:lvl>
+    <w:lvl w:ilvl="3" w:tplc="0809000F" w:tentative="1">
+      <w:start w:val="1"/>
+      <w:numFmt w:val="decimal"/>
+      <w:lvlText w:val="%4."/>
+      <w:lvlJc w:val="left"/>
+      <w:pPr>
+        <w:ind w:left="2925" w:hanging="360"/>
+      </w:pPr>
+    </w:lvl>
+    <w:lvl w:ilvl="4" w:tplc="08090019" w:tentative="1">
+      <w:start w:val="1"/>
+      <w:numFmt w:val="lowerLetter"/>
+      <w:lvlText w:val="%5."/>
+      <w:lvlJc w:val="left"/>
+      <w:pPr>
+        <w:ind w:left="3645" w:hanging="360"/>
+      </w:pPr>
+    </w:lvl>
+    <w:lvl w:ilvl="5" w:tplc="0809001B" w:tentative="1">
+      <w:start w:val="1"/>
+      <w:numFmt w:val="lowerRoman"/>
+      <w:lvlText w:val="%6."/>
+      <w:lvlJc w:val="right"/>
+      <w:pPr>
+        <w:ind w:left="4365" w:hanging="180"/>
+      </w:pPr>
+    </w:lvl>
+    <w:lvl w:ilvl="6" w:tplc="0809000F" w:tentative="1">
+      <w:start w:val="1"/>
+      <w:numFmt w:val="decimal"/>
+      <w:lvlText w:val="%7."/>
+      <w:lvlJc w:val="left"/>
+      <w:pPr>
+        <w:ind w:left="5085" w:hanging="360"/>
+      </w:pPr>
+    </w:lvl>
+    <w:lvl w:ilvl="7" w:tplc="08090019" w:tentative="1">
+      <w:start w:val="1"/>
+      <w:numFmt w:val="lowerLetter"/>
+      <w:lvlText w:val="%8."/>
+      <w:lvlJc w:val="left"/>
+      <w:pPr>
+        <w:ind w:left="5805" w:hanging="360"/>
+      </w:pPr>
+    </w:lvl>
+    <w:lvl w:ilvl="8" w:tplc="0809001B" w:tentative="1">
+      <w:start w:val="1"/>
+      <w:numFmt w:val="lowerRoman"/>
+      <w:lvlText w:val="%9."/>
+      <w:lvlJc w:val="right"/>
+      <w:pPr>
+        <w:ind w:left="6525" w:hanging="180"/>
+      </w:pPr>
+    </w:lvl>
+  </w:abstractNum>
+  <w:abstractNum w:abstractNumId="5" w15:restartNumberingAfterBreak="0">
+    <w:nsid w:val="19C0209C"/>
+    <w:multiLevelType w:val="hybridMultilevel"/>
+    <w:tmpl w:val="85AA5AA8"/>
+    <w:lvl w:ilvl="0" w:tplc="08090001">
+      <w:start w:val="1"/>
+      <w:numFmt w:val="bullet"/>
+      <w:lvlText w:val=""/>
+      <w:lvlJc w:val="left"/>
+      <w:pPr>
+        <w:ind w:left="360" w:hanging="360"/>
+      </w:pPr>
+      <w:rPr>
+        <w:rFonts w:ascii="Symbol" w:hAnsi="Symbol" w:hint="default"/>
+      </w:rPr>
+    </w:lvl>
+    <w:lvl w:ilvl="1" w:tplc="08090003" w:tentative="1">
+      <w:start w:val="1"/>
+      <w:numFmt w:val="bullet"/>
+      <w:lvlText w:val="o"/>
+      <w:lvlJc w:val="left"/>
+      <w:pPr>
+        <w:ind w:left="1080" w:hanging="360"/>
+      </w:pPr>
+      <w:rPr>
+        <w:rFonts w:ascii="Courier New" w:hAnsi="Courier New" w:cs="Courier New" w:hint="default"/>
+      </w:rPr>
+    </w:lvl>
+    <w:lvl w:ilvl="2" w:tplc="08090005" w:tentative="1">
+      <w:start w:val="1"/>
+      <w:numFmt w:val="bullet"/>
+      <w:lvlText w:val=""/>
+      <w:lvlJc w:val="left"/>
+      <w:pPr>
+        <w:ind w:left="1800" w:hanging="360"/>
+      </w:pPr>
+      <w:rPr>
+        <w:rFonts w:ascii="Wingdings" w:hAnsi="Wingdings" w:hint="default"/>
+      </w:rPr>
+    </w:lvl>
+    <w:lvl w:ilvl="3" w:tplc="08090001" w:tentative="1">
+      <w:start w:val="1"/>
+      <w:numFmt w:val="bullet"/>
+      <w:lvlText w:val=""/>
+      <w:lvlJc w:val="left"/>
+      <w:pPr>
+        <w:ind w:left="2520" w:hanging="360"/>
+      </w:pPr>
+      <w:rPr>
+        <w:rFonts w:ascii="Symbol" w:hAnsi="Symbol" w:hint="default"/>
+      </w:rPr>
+    </w:lvl>
+    <w:lvl w:ilvl="4" w:tplc="08090003" w:tentative="1">
+      <w:start w:val="1"/>
+      <w:numFmt w:val="bullet"/>
+      <w:lvlText w:val="o"/>
+      <w:lvlJc w:val="left"/>
+      <w:pPr>
+        <w:ind w:left="3240" w:hanging="360"/>
+      </w:pPr>
+      <w:rPr>
+        <w:rFonts w:ascii="Courier New" w:hAnsi="Courier New" w:cs="Courier New" w:hint="default"/>
+      </w:rPr>
+    </w:lvl>
+    <w:lvl w:ilvl="5" w:tplc="08090005" w:tentative="1">
+      <w:start w:val="1"/>
+      <w:numFmt w:val="bullet"/>
+      <w:lvlText w:val=""/>
+      <w:lvlJc w:val="left"/>
+      <w:pPr>
+        <w:ind w:left="3960" w:hanging="360"/>
+      </w:pPr>
+      <w:rPr>
+        <w:rFonts w:ascii="Wingdings" w:hAnsi="Wingdings" w:hint="default"/>
+      </w:rPr>
+    </w:lvl>
+    <w:lvl w:ilvl="6" w:tplc="08090001" w:tentative="1">
+      <w:start w:val="1"/>
+      <w:numFmt w:val="bullet"/>
+      <w:lvlText w:val=""/>
+      <w:lvlJc w:val="left"/>
+      <w:pPr>
+        <w:ind w:left="4680" w:hanging="360"/>
+      </w:pPr>
+      <w:rPr>
+        <w:rFonts w:ascii="Symbol" w:hAnsi="Symbol" w:hint="default"/>
+      </w:rPr>
+    </w:lvl>
+    <w:lvl w:ilvl="7" w:tplc="08090003" w:tentative="1">
+      <w:start w:val="1"/>
+      <w:numFmt w:val="bullet"/>
+      <w:lvlText w:val="o"/>
+      <w:lvlJc w:val="left"/>
+      <w:pPr>
+        <w:ind w:left="5400" w:hanging="360"/>
+      </w:pPr>
+      <w:rPr>
+        <w:rFonts w:ascii="Courier New" w:hAnsi="Courier New" w:cs="Courier New" w:hint="default"/>
+      </w:rPr>
+    </w:lvl>
+    <w:lvl w:ilvl="8" w:tplc="08090005" w:tentative="1">
+      <w:start w:val="1"/>
+      <w:numFmt w:val="bullet"/>
+      <w:lvlText w:val=""/>
+      <w:lvlJc w:val="left"/>
+      <w:pPr>
+        <w:ind w:left="6120" w:hanging="360"/>
+      </w:pPr>
+      <w:rPr>
+        <w:rFonts w:ascii="Wingdings" w:hAnsi="Wingdings" w:hint="default"/>
+      </w:rPr>
+    </w:lvl>
+  </w:abstractNum>
+  <w:abstractNum w:abstractNumId="6" w15:restartNumberingAfterBreak="0">
+    <w:nsid w:val="1B750CFF"/>
+    <w:multiLevelType w:val="hybridMultilevel"/>
+    <w:tmpl w:val="8F60DCF6"/>
+    <w:lvl w:ilvl="0" w:tplc="08090001">
+      <w:start w:val="1"/>
+      <w:numFmt w:val="bullet"/>
+      <w:lvlText w:val=""/>
+      <w:lvlJc w:val="left"/>
+      <w:pPr>
+        <w:ind w:left="720" w:hanging="360"/>
+      </w:pPr>
+      <w:rPr>
+        <w:rFonts w:ascii="Symbol" w:hAnsi="Symbol" w:hint="default"/>
+      </w:rPr>
+    </w:lvl>
+    <w:lvl w:ilvl="1" w:tplc="08090003" w:tentative="1">
+      <w:start w:val="1"/>
+      <w:numFmt w:val="bullet"/>
+      <w:lvlText w:val="o"/>
+      <w:lvlJc w:val="left"/>
+      <w:pPr>
+        <w:ind w:left="1440" w:hanging="360"/>
+      </w:pPr>
+      <w:rPr>
+        <w:rFonts w:ascii="Courier New" w:hAnsi="Courier New" w:cs="Courier New" w:hint="default"/>
+      </w:rPr>
+    </w:lvl>
+    <w:lvl w:ilvl="2" w:tplc="08090005" w:tentative="1">
+      <w:start w:val="1"/>
+      <w:numFmt w:val="bullet"/>
+      <w:lvlText w:val=""/>
+      <w:lvlJc w:val="left"/>
+      <w:pPr>
+        <w:ind w:left="2160" w:hanging="360"/>
+      </w:pPr>
+      <w:rPr>
+        <w:rFonts w:ascii="Wingdings" w:hAnsi="Wingdings" w:hint="default"/>
+      </w:rPr>
+    </w:lvl>
+    <w:lvl w:ilvl="3" w:tplc="08090001" w:tentative="1">
+      <w:start w:val="1"/>
+      <w:numFmt w:val="bullet"/>
+      <w:lvlText w:val=""/>
+      <w:lvlJc w:val="left"/>
+      <w:pPr>
+        <w:ind w:left="2880" w:hanging="360"/>
+      </w:pPr>
+      <w:rPr>
+        <w:rFonts w:ascii="Symbol" w:hAnsi="Symbol" w:hint="default"/>
+      </w:rPr>
+    </w:lvl>
+    <w:lvl w:ilvl="4" w:tplc="08090003" w:tentative="1">
+      <w:start w:val="1"/>
+      <w:numFmt w:val="bullet"/>
+      <w:lvlText w:val="o"/>
+      <w:lvlJc w:val="left"/>
+      <w:pPr>
+        <w:ind w:left="3600" w:hanging="360"/>
+      </w:pPr>
+      <w:rPr>
+        <w:rFonts w:ascii="Courier New" w:hAnsi="Courier New" w:cs="Courier New" w:hint="default"/>
+      </w:rPr>
+    </w:lvl>
+    <w:lvl w:ilvl="5" w:tplc="08090005" w:tentative="1">
+      <w:start w:val="1"/>
+      <w:numFmt w:val="bullet"/>
+      <w:lvlText w:val=""/>
+      <w:lvlJc w:val="left"/>
+      <w:pPr>
+        <w:ind w:left="4320" w:hanging="360"/>
+      </w:pPr>
+      <w:rPr>
+        <w:rFonts w:ascii="Wingdings" w:hAnsi="Wingdings" w:hint="default"/>
+      </w:rPr>
+    </w:lvl>
+    <w:lvl w:ilvl="6" w:tplc="08090001" w:tentative="1">
+      <w:start w:val="1"/>
+      <w:numFmt w:val="bullet"/>
+      <w:lvlText w:val=""/>
+      <w:lvlJc w:val="left"/>
+      <w:pPr>
+        <w:ind w:left="5040" w:hanging="360"/>
+      </w:pPr>
+      <w:rPr>
+        <w:rFonts w:ascii="Symbol" w:hAnsi="Symbol" w:hint="default"/>
+      </w:rPr>
+    </w:lvl>
+    <w:lvl w:ilvl="7" w:tplc="08090003" w:tentative="1">
+      <w:start w:val="1"/>
+      <w:numFmt w:val="bullet"/>
+      <w:lvlText w:val="o"/>
+      <w:lvlJc w:val="left"/>
+      <w:pPr>
+        <w:ind w:left="5760" w:hanging="360"/>
+      </w:pPr>
+      <w:rPr>
+        <w:rFonts w:ascii="Courier New" w:hAnsi="Courier New" w:cs="Courier New" w:hint="default"/>
+      </w:rPr>
+    </w:lvl>
+    <w:lvl w:ilvl="8" w:tplc="08090005" w:tentative="1">
+      <w:start w:val="1"/>
+      <w:numFmt w:val="bullet"/>
+      <w:lvlText w:val=""/>
+      <w:lvlJc w:val="left"/>
+      <w:pPr>
+        <w:ind w:left="6480" w:hanging="360"/>
+      </w:pPr>
+      <w:rPr>
+        <w:rFonts w:ascii="Wingdings" w:hAnsi="Wingdings" w:hint="default"/>
+      </w:rPr>
+    </w:lvl>
+  </w:abstractNum>
+  <w:abstractNum w:abstractNumId="7" w15:restartNumberingAfterBreak="0">
+    <w:nsid w:val="1E683628"/>
+    <w:multiLevelType w:val="hybridMultilevel"/>
+    <w:tmpl w:val="BB808E38"/>
+    <w:lvl w:ilvl="0" w:tplc="08090001">
+      <w:start w:val="1"/>
+      <w:numFmt w:val="bullet"/>
+      <w:lvlText w:val=""/>
+      <w:lvlJc w:val="left"/>
+      <w:pPr>
+        <w:ind w:left="360" w:hanging="360"/>
+      </w:pPr>
+      <w:rPr>
+        <w:rFonts w:ascii="Symbol" w:hAnsi="Symbol" w:hint="default"/>
+      </w:rPr>
+    </w:lvl>
+    <w:lvl w:ilvl="1" w:tplc="08090003" w:tentative="1">
+      <w:start w:val="1"/>
+      <w:numFmt w:val="bullet"/>
+      <w:lvlText w:val="o"/>
+      <w:lvlJc w:val="left"/>
+      <w:pPr>
+        <w:ind w:left="1080" w:hanging="360"/>
+      </w:pPr>
+      <w:rPr>
+        <w:rFonts w:ascii="Courier New" w:hAnsi="Courier New" w:cs="Courier New" w:hint="default"/>
+      </w:rPr>
+    </w:lvl>
+    <w:lvl w:ilvl="2" w:tplc="08090005" w:tentative="1">
+      <w:start w:val="1"/>
+      <w:numFmt w:val="bullet"/>
+      <w:lvlText w:val=""/>
+      <w:lvlJc w:val="left"/>
+      <w:pPr>
+        <w:ind w:left="1800" w:hanging="360"/>
+      </w:pPr>
+      <w:rPr>
+        <w:rFonts w:ascii="Wingdings" w:hAnsi="Wingdings" w:hint="default"/>
+      </w:rPr>
+    </w:lvl>
+    <w:lvl w:ilvl="3" w:tplc="08090001" w:tentative="1">
+      <w:start w:val="1"/>
+      <w:numFmt w:val="bullet"/>
+      <w:lvlText w:val=""/>
+      <w:lvlJc w:val="left"/>
+      <w:pPr>
+        <w:ind w:left="2520" w:hanging="360"/>
+      </w:pPr>
+      <w:rPr>
+        <w:rFonts w:ascii="Symbol" w:hAnsi="Symbol" w:hint="default"/>
+      </w:rPr>
+    </w:lvl>
+    <w:lvl w:ilvl="4" w:tplc="08090003" w:tentative="1">
+      <w:start w:val="1"/>
+      <w:numFmt w:val="bullet"/>
+      <w:lvlText w:val="o"/>
+      <w:lvlJc w:val="left"/>
+      <w:pPr>
+        <w:ind w:left="3240" w:hanging="360"/>
+      </w:pPr>
+      <w:rPr>
+        <w:rFonts w:ascii="Courier New" w:hAnsi="Courier New" w:cs="Courier New" w:hint="default"/>
+      </w:rPr>
+    </w:lvl>
+    <w:lvl w:ilvl="5" w:tplc="08090005" w:tentative="1">
+      <w:start w:val="1"/>
+      <w:numFmt w:val="bullet"/>
+      <w:lvlText w:val=""/>
+      <w:lvlJc w:val="left"/>
+      <w:pPr>
+        <w:ind w:left="3960" w:hanging="360"/>
+      </w:pPr>
+      <w:rPr>
+        <w:rFonts w:ascii="Wingdings" w:hAnsi="Wingdings" w:hint="default"/>
+      </w:rPr>
+    </w:lvl>
+    <w:lvl w:ilvl="6" w:tplc="08090001" w:tentative="1">
+      <w:start w:val="1"/>
+      <w:numFmt w:val="bullet"/>
+      <w:lvlText w:val=""/>
+      <w:lvlJc w:val="left"/>
+      <w:pPr>
+        <w:ind w:left="4680" w:hanging="360"/>
+      </w:pPr>
+      <w:rPr>
+        <w:rFonts w:ascii="Symbol" w:hAnsi="Symbol" w:hint="default"/>
+      </w:rPr>
+    </w:lvl>
+    <w:lvl w:ilvl="7" w:tplc="08090003" w:tentative="1">
+      <w:start w:val="1"/>
+      <w:numFmt w:val="bullet"/>
+      <w:lvlText w:val="o"/>
+      <w:lvlJc w:val="left"/>
+      <w:pPr>
+        <w:ind w:left="5400" w:hanging="360"/>
+      </w:pPr>
+      <w:rPr>
+        <w:rFonts w:ascii="Courier New" w:hAnsi="Courier New" w:cs="Courier New" w:hint="default"/>
+      </w:rPr>
+    </w:lvl>
+    <w:lvl w:ilvl="8" w:tplc="08090005" w:tentative="1">
+      <w:start w:val="1"/>
+      <w:numFmt w:val="bullet"/>
+      <w:lvlText w:val=""/>
+      <w:lvlJc w:val="left"/>
+      <w:pPr>
+        <w:ind w:left="6120" w:hanging="360"/>
+      </w:pPr>
+      <w:rPr>
+        <w:rFonts w:ascii="Wingdings" w:hAnsi="Wingdings" w:hint="default"/>
+      </w:rPr>
+    </w:lvl>
+  </w:abstractNum>
+  <w:abstractNum w:abstractNumId="8" w15:restartNumberingAfterBreak="0">
+    <w:nsid w:val="21D81D81"/>
+    <w:multiLevelType w:val="hybridMultilevel"/>
+    <w:tmpl w:val="4DE0158C"/>
+    <w:lvl w:ilvl="0" w:tplc="08090001">
+      <w:start w:val="1"/>
+      <w:numFmt w:val="bullet"/>
+      <w:lvlText w:val=""/>
+      <w:lvlJc w:val="left"/>
+      <w:pPr>
+        <w:ind w:left="360" w:hanging="360"/>
+      </w:pPr>
+      <w:rPr>
+        <w:rFonts w:ascii="Symbol" w:hAnsi="Symbol" w:hint="default"/>
+      </w:rPr>
+    </w:lvl>
+    <w:lvl w:ilvl="1" w:tplc="08090003" w:tentative="1">
+      <w:start w:val="1"/>
+      <w:numFmt w:val="bullet"/>
+      <w:lvlText w:val="o"/>
+      <w:lvlJc w:val="left"/>
+      <w:pPr>
+        <w:ind w:left="1080" w:hanging="360"/>
+      </w:pPr>
+      <w:rPr>
+        <w:rFonts w:ascii="Courier New" w:hAnsi="Courier New" w:cs="Courier New" w:hint="default"/>
+      </w:rPr>
+    </w:lvl>
+    <w:lvl w:ilvl="2" w:tplc="08090005" w:tentative="1">
+      <w:start w:val="1"/>
+      <w:numFmt w:val="bullet"/>
+      <w:lvlText w:val=""/>
+      <w:lvlJc w:val="left"/>
+      <w:pPr>
+        <w:ind w:left="1800" w:hanging="360"/>
+      </w:pPr>
+      <w:rPr>
+        <w:rFonts w:ascii="Wingdings" w:hAnsi="Wingdings" w:hint="default"/>
+      </w:rPr>
+    </w:lvl>
+    <w:lvl w:ilvl="3" w:tplc="08090001" w:tentative="1">
+      <w:start w:val="1"/>
+      <w:numFmt w:val="bullet"/>
+      <w:lvlText w:val=""/>
+      <w:lvlJc w:val="left"/>
+      <w:pPr>
+        <w:ind w:left="2520" w:hanging="360"/>
+      </w:pPr>
+      <w:rPr>
+        <w:rFonts w:ascii="Symbol" w:hAnsi="Symbol" w:hint="default"/>
+      </w:rPr>
+    </w:lvl>
+    <w:lvl w:ilvl="4" w:tplc="08090003" w:tentative="1">
+      <w:start w:val="1"/>
+      <w:numFmt w:val="bullet"/>
+      <w:lvlText w:val="o"/>
+      <w:lvlJc w:val="left"/>
+      <w:pPr>
+        <w:ind w:left="3240" w:hanging="360"/>
+      </w:pPr>
+      <w:rPr>
+        <w:rFonts w:ascii="Courier New" w:hAnsi="Courier New" w:cs="Courier New" w:hint="default"/>
+      </w:rPr>
+    </w:lvl>
+    <w:lvl w:ilvl="5" w:tplc="08090005" w:tentative="1">
+      <w:start w:val="1"/>
+      <w:numFmt w:val="bullet"/>
+      <w:lvlText w:val=""/>
+      <w:lvlJc w:val="left"/>
+      <w:pPr>
+        <w:ind w:left="3960" w:hanging="360"/>
+      </w:pPr>
+      <w:rPr>
+        <w:rFonts w:ascii="Wingdings" w:hAnsi="Wingdings" w:hint="default"/>
+      </w:rPr>
+    </w:lvl>
+    <w:lvl w:ilvl="6" w:tplc="08090001" w:tentative="1">
+      <w:start w:val="1"/>
+      <w:numFmt w:val="bullet"/>
+      <w:lvlText w:val=""/>
+      <w:lvlJc w:val="left"/>
+      <w:pPr>
+        <w:ind w:left="4680" w:hanging="360"/>
+      </w:pPr>
+      <w:rPr>
+        <w:rFonts w:ascii="Symbol" w:hAnsi="Symbol" w:hint="default"/>
+      </w:rPr>
+    </w:lvl>
+    <w:lvl w:ilvl="7" w:tplc="08090003" w:tentative="1">
+      <w:start w:val="1"/>
+      <w:numFmt w:val="bullet"/>
+      <w:lvlText w:val="o"/>
+      <w:lvlJc w:val="left"/>
+      <w:pPr>
+        <w:ind w:left="5400" w:hanging="360"/>
+      </w:pPr>
+      <w:rPr>
+        <w:rFonts w:ascii="Courier New" w:hAnsi="Courier New" w:cs="Courier New" w:hint="default"/>
+      </w:rPr>
+    </w:lvl>
+    <w:lvl w:ilvl="8" w:tplc="08090005" w:tentative="1">
+      <w:start w:val="1"/>
+      <w:numFmt w:val="bullet"/>
+      <w:lvlText w:val=""/>
+      <w:lvlJc w:val="left"/>
+      <w:pPr>
+        <w:ind w:left="6120" w:hanging="360"/>
+      </w:pPr>
+      <w:rPr>
+        <w:rFonts w:ascii="Wingdings" w:hAnsi="Wingdings" w:hint="default"/>
+      </w:rPr>
+    </w:lvl>
+  </w:abstractNum>
+  <w:abstractNum w:abstractNumId="9" w15:restartNumberingAfterBreak="0">
+    <w:nsid w:val="33D237E1"/>
+    <w:multiLevelType w:val="hybridMultilevel"/>
+    <w:tmpl w:val="ECDC44C2"/>
+    <w:lvl w:ilvl="0" w:tplc="08090001">
+      <w:start w:val="1"/>
+      <w:numFmt w:val="bullet"/>
+      <w:lvlText w:val=""/>
+      <w:lvlJc w:val="left"/>
+      <w:pPr>
+        <w:ind w:left="360" w:hanging="360"/>
+      </w:pPr>
+      <w:rPr>
+        <w:rFonts w:ascii="Symbol" w:hAnsi="Symbol" w:hint="default"/>
+      </w:rPr>
+    </w:lvl>
+    <w:lvl w:ilvl="1" w:tplc="08090003" w:tentative="1">
+      <w:start w:val="1"/>
+      <w:numFmt w:val="bullet"/>
+      <w:lvlText w:val="o"/>
+      <w:lvlJc w:val="left"/>
+      <w:pPr>
+        <w:ind w:left="1080" w:hanging="360"/>
+      </w:pPr>
+      <w:rPr>
+        <w:rFonts w:ascii="Courier New" w:hAnsi="Courier New" w:cs="Courier New" w:hint="default"/>
+      </w:rPr>
+    </w:lvl>
+    <w:lvl w:ilvl="2" w:tplc="08090005" w:tentative="1">
+      <w:start w:val="1"/>
+      <w:numFmt w:val="bullet"/>
+      <w:lvlText w:val=""/>
+      <w:lvlJc w:val="left"/>
+      <w:pPr>
+        <w:ind w:left="1800" w:hanging="360"/>
+      </w:pPr>
+      <w:rPr>
+        <w:rFonts w:ascii="Wingdings" w:hAnsi="Wingdings" w:hint="default"/>
+      </w:rPr>
+    </w:lvl>
+    <w:lvl w:ilvl="3" w:tplc="08090001" w:tentative="1">
+      <w:start w:val="1"/>
+      <w:numFmt w:val="bullet"/>
+      <w:lvlText w:val=""/>
+      <w:lvlJc w:val="left"/>
+      <w:pPr>
+        <w:ind w:left="2520" w:hanging="360"/>
+      </w:pPr>
+      <w:rPr>
+        <w:rFonts w:ascii="Symbol" w:hAnsi="Symbol" w:hint="default"/>
+      </w:rPr>
+    </w:lvl>
+    <w:lvl w:ilvl="4" w:tplc="08090003" w:tentative="1">
+      <w:start w:val="1"/>
+      <w:numFmt w:val="bullet"/>
+      <w:lvlText w:val="o"/>
+      <w:lvlJc w:val="left"/>
+      <w:pPr>
+        <w:ind w:left="3240" w:hanging="360"/>
+      </w:pPr>
+      <w:rPr>
+        <w:rFonts w:ascii="Courier New" w:hAnsi="Courier New" w:cs="Courier New" w:hint="default"/>
+      </w:rPr>
+    </w:lvl>
+    <w:lvl w:ilvl="5" w:tplc="08090005" w:tentative="1">
+      <w:start w:val="1"/>
+      <w:numFmt w:val="bullet"/>
+      <w:lvlText w:val=""/>
+      <w:lvlJc w:val="left"/>
+      <w:pPr>
+        <w:ind w:left="3960" w:hanging="360"/>
+      </w:pPr>
+      <w:rPr>
+        <w:rFonts w:ascii="Wingdings" w:hAnsi="Wingdings" w:hint="default"/>
+      </w:rPr>
+    </w:lvl>
+    <w:lvl w:ilvl="6" w:tplc="08090001" w:tentative="1">
+      <w:start w:val="1"/>
+      <w:numFmt w:val="bullet"/>
+      <w:lvlText w:val=""/>
+      <w:lvlJc w:val="left"/>
+      <w:pPr>
+        <w:ind w:left="4680" w:hanging="360"/>
+      </w:pPr>
+      <w:rPr>
+        <w:rFonts w:ascii="Symbol" w:hAnsi="Symbol" w:hint="default"/>
+      </w:rPr>
+    </w:lvl>
+    <w:lvl w:ilvl="7" w:tplc="08090003" w:tentative="1">
+      <w:start w:val="1"/>
+      <w:numFmt w:val="bullet"/>
+      <w:lvlText w:val="o"/>
+      <w:lvlJc w:val="left"/>
+      <w:pPr>
+        <w:ind w:left="5400" w:hanging="360"/>
+      </w:pPr>
+      <w:rPr>
+        <w:rFonts w:ascii="Courier New" w:hAnsi="Courier New" w:cs="Courier New" w:hint="default"/>
+      </w:rPr>
+    </w:lvl>
+    <w:lvl w:ilvl="8" w:tplc="08090005" w:tentative="1">
+      <w:start w:val="1"/>
+      <w:numFmt w:val="bullet"/>
+      <w:lvlText w:val=""/>
+      <w:lvlJc w:val="left"/>
+      <w:pPr>
+        <w:ind w:left="6120" w:hanging="360"/>
+      </w:pPr>
+      <w:rPr>
+        <w:rFonts w:ascii="Wingdings" w:hAnsi="Wingdings" w:hint="default"/>
+      </w:rPr>
+    </w:lvl>
+  </w:abstractNum>
+  <w:abstractNum w:abstractNumId="10" w15:restartNumberingAfterBreak="0">
+    <w:nsid w:val="3FDA4B04"/>
+    <w:multiLevelType w:val="hybridMultilevel"/>
+    <w:tmpl w:val="33A48344"/>
+    <w:lvl w:ilvl="0" w:tplc="08090001">
+      <w:start w:val="1"/>
+      <w:numFmt w:val="bullet"/>
+      <w:lvlText w:val=""/>
+      <w:lvlJc w:val="left"/>
+      <w:pPr>
+        <w:ind w:left="720" w:hanging="360"/>
+      </w:pPr>
+      <w:rPr>
+        <w:rFonts w:ascii="Symbol" w:hAnsi="Symbol" w:hint="default"/>
+      </w:rPr>
+    </w:lvl>
+    <w:lvl w:ilvl="1" w:tplc="08090003" w:tentative="1">
+      <w:start w:val="1"/>
+      <w:numFmt w:val="bullet"/>
+      <w:lvlText w:val="o"/>
+      <w:lvlJc w:val="left"/>
+      <w:pPr>
+        <w:ind w:left="1440" w:hanging="360"/>
+      </w:pPr>
+      <w:rPr>
+        <w:rFonts w:ascii="Courier New" w:hAnsi="Courier New" w:cs="Courier New" w:hint="default"/>
+      </w:rPr>
+    </w:lvl>
+    <w:lvl w:ilvl="2" w:tplc="08090005" w:tentative="1">
+      <w:start w:val="1"/>
+      <w:numFmt w:val="bullet"/>
+      <w:lvlText w:val=""/>
+      <w:lvlJc w:val="left"/>
+      <w:pPr>
+        <w:ind w:left="2160" w:hanging="360"/>
+      </w:pPr>
+      <w:rPr>
+        <w:rFonts w:ascii="Wingdings" w:hAnsi="Wingdings" w:hint="default"/>
+      </w:rPr>
+    </w:lvl>
+    <w:lvl w:ilvl="3" w:tplc="08090001" w:tentative="1">
+      <w:start w:val="1"/>
+      <w:numFmt w:val="bullet"/>
+      <w:lvlText w:val=""/>
+      <w:lvlJc w:val="left"/>
+      <w:pPr>
+        <w:ind w:left="2880" w:hanging="360"/>
+      </w:pPr>
+      <w:rPr>
+        <w:rFonts w:ascii="Symbol" w:hAnsi="Symbol" w:hint="default"/>
+      </w:rPr>
+    </w:lvl>
+    <w:lvl w:ilvl="4" w:tplc="08090003" w:tentative="1">
+      <w:start w:val="1"/>
+      <w:numFmt w:val="bullet"/>
+      <w:lvlText w:val="o"/>
+      <w:lvlJc w:val="left"/>
+      <w:pPr>
+        <w:ind w:left="3600" w:hanging="360"/>
+      </w:pPr>
+      <w:rPr>
+        <w:rFonts w:ascii="Courier New" w:hAnsi="Courier New" w:cs="Courier New" w:hint="default"/>
+      </w:rPr>
+    </w:lvl>
+    <w:lvl w:ilvl="5" w:tplc="08090005" w:tentative="1">
+      <w:start w:val="1"/>
+      <w:numFmt w:val="bullet"/>
+      <w:lvlText w:val=""/>
+      <w:lvlJc w:val="left"/>
+      <w:pPr>
+        <w:ind w:left="4320" w:hanging="360"/>
+      </w:pPr>
+      <w:rPr>
+        <w:rFonts w:ascii="Wingdings" w:hAnsi="Wingdings" w:hint="default"/>
+      </w:rPr>
+    </w:lvl>
+    <w:lvl w:ilvl="6" w:tplc="08090001" w:tentative="1">
+      <w:start w:val="1"/>
+      <w:numFmt w:val="bullet"/>
+      <w:lvlText w:val=""/>
+      <w:lvlJc w:val="left"/>
+      <w:pPr>
+        <w:ind w:left="5040" w:hanging="360"/>
+      </w:pPr>
+      <w:rPr>
+        <w:rFonts w:ascii="Symbol" w:hAnsi="Symbol" w:hint="default"/>
+      </w:rPr>
+    </w:lvl>
+    <w:lvl w:ilvl="7" w:tplc="08090003" w:tentative="1">
+      <w:start w:val="1"/>
+      <w:numFmt w:val="bullet"/>
+      <w:lvlText w:val="o"/>
+      <w:lvlJc w:val="left"/>
+      <w:pPr>
+        <w:ind w:left="5760" w:hanging="360"/>
+      </w:pPr>
+      <w:rPr>
+        <w:rFonts w:ascii="Courier New" w:hAnsi="Courier New" w:cs="Courier New" w:hint="default"/>
+      </w:rPr>
+    </w:lvl>
+    <w:lvl w:ilvl="8" w:tplc="08090005" w:tentative="1">
+      <w:start w:val="1"/>
+      <w:numFmt w:val="bullet"/>
+      <w:lvlText w:val=""/>
+      <w:lvlJc w:val="left"/>
+      <w:pPr>
+        <w:ind w:left="6480" w:hanging="360"/>
+      </w:pPr>
+      <w:rPr>
+        <w:rFonts w:ascii="Wingdings" w:hAnsi="Wingdings" w:hint="default"/>
+      </w:rPr>
+    </w:lvl>
+  </w:abstractNum>
+  <w:abstractNum w:abstractNumId="11" w15:restartNumberingAfterBreak="0">
+    <w:nsid w:val="475B299C"/>
+    <w:multiLevelType w:val="hybridMultilevel"/>
+    <w:tmpl w:val="FF9CC47E"/>
+    <w:lvl w:ilvl="0" w:tplc="08090001">
+      <w:start w:val="1"/>
+      <w:numFmt w:val="bullet"/>
+      <w:lvlText w:val=""/>
+      <w:lvlJc w:val="left"/>
+      <w:pPr>
+        <w:ind w:left="360" w:hanging="360"/>
+      </w:pPr>
+      <w:rPr>
+        <w:rFonts w:ascii="Symbol" w:hAnsi="Symbol" w:hint="default"/>
+      </w:rPr>
+    </w:lvl>
+    <w:lvl w:ilvl="1" w:tplc="08090003" w:tentative="1">
+      <w:start w:val="1"/>
+      <w:numFmt w:val="bullet"/>
+      <w:lvlText w:val="o"/>
+      <w:lvlJc w:val="left"/>
+      <w:pPr>
+        <w:ind w:left="1080" w:hanging="360"/>
+      </w:pPr>
+      <w:rPr>
+        <w:rFonts w:ascii="Courier New" w:hAnsi="Courier New" w:cs="Courier New" w:hint="default"/>
+      </w:rPr>
+    </w:lvl>
+    <w:lvl w:ilvl="2" w:tplc="08090005" w:tentative="1">
+      <w:start w:val="1"/>
+      <w:numFmt w:val="bullet"/>
+      <w:lvlText w:val=""/>
+      <w:lvlJc w:val="left"/>
+      <w:pPr>
+        <w:ind w:left="1800" w:hanging="360"/>
+      </w:pPr>
+      <w:rPr>
+        <w:rFonts w:ascii="Wingdings" w:hAnsi="Wingdings" w:hint="default"/>
+      </w:rPr>
+    </w:lvl>
+    <w:lvl w:ilvl="3" w:tplc="08090001" w:tentative="1">
+      <w:start w:val="1"/>
+      <w:numFmt w:val="bullet"/>
+      <w:lvlText w:val=""/>
+      <w:lvlJc w:val="left"/>
+      <w:pPr>
+        <w:ind w:left="2520" w:hanging="360"/>
+      </w:pPr>
+      <w:rPr>
+        <w:rFonts w:ascii="Symbol" w:hAnsi="Symbol" w:hint="default"/>
+      </w:rPr>
+    </w:lvl>
+    <w:lvl w:ilvl="4" w:tplc="08090003" w:tentative="1">
+      <w:start w:val="1"/>
+      <w:numFmt w:val="bullet"/>
+      <w:lvlText w:val="o"/>
+      <w:lvlJc w:val="left"/>
+      <w:pPr>
+        <w:ind w:left="3240" w:hanging="360"/>
+      </w:pPr>
+      <w:rPr>
+        <w:rFonts w:ascii="Courier New" w:hAnsi="Courier New" w:cs="Courier New" w:hint="default"/>
+      </w:rPr>
+    </w:lvl>
+    <w:lvl w:ilvl="5" w:tplc="08090005" w:tentative="1">
+      <w:start w:val="1"/>
+      <w:numFmt w:val="bullet"/>
+      <w:lvlText w:val=""/>
+      <w:lvlJc w:val="left"/>
+      <w:pPr>
+        <w:ind w:left="3960" w:hanging="360"/>
+      </w:pPr>
+      <w:rPr>
+        <w:rFonts w:ascii="Wingdings" w:hAnsi="Wingdings" w:hint="default"/>
+      </w:rPr>
+    </w:lvl>
+    <w:lvl w:ilvl="6" w:tplc="08090001" w:tentative="1">
+      <w:start w:val="1"/>
+      <w:numFmt w:val="bullet"/>
+      <w:lvlText w:val=""/>
+      <w:lvlJc w:val="left"/>
+      <w:pPr>
+        <w:ind w:left="4680" w:hanging="360"/>
+      </w:pPr>
+      <w:rPr>
+        <w:rFonts w:ascii="Symbol" w:hAnsi="Symbol" w:hint="default"/>
+      </w:rPr>
+    </w:lvl>
+    <w:lvl w:ilvl="7" w:tplc="08090003" w:tentative="1">
+      <w:start w:val="1"/>
+      <w:numFmt w:val="bullet"/>
+      <w:lvlText w:val="o"/>
+      <w:lvlJc w:val="left"/>
+      <w:pPr>
+        <w:ind w:left="5400" w:hanging="360"/>
+      </w:pPr>
+      <w:rPr>
+        <w:rFonts w:ascii="Courier New" w:hAnsi="Courier New" w:cs="Courier New" w:hint="default"/>
+      </w:rPr>
+    </w:lvl>
+    <w:lvl w:ilvl="8" w:tplc="08090005" w:tentative="1">
+      <w:start w:val="1"/>
+      <w:numFmt w:val="bullet"/>
+      <w:lvlText w:val=""/>
+      <w:lvlJc w:val="left"/>
+      <w:pPr>
+        <w:ind w:left="6120" w:hanging="360"/>
+      </w:pPr>
+      <w:rPr>
+        <w:rFonts w:ascii="Wingdings" w:hAnsi="Wingdings" w:hint="default"/>
+      </w:rPr>
+    </w:lvl>
+  </w:abstractNum>
+  <w:abstractNum w:abstractNumId="12" w15:restartNumberingAfterBreak="0">
+    <w:nsid w:val="5DE02F13"/>
+    <w:multiLevelType w:val="hybridMultilevel"/>
+    <w:tmpl w:val="4FC2533A"/>
+    <w:lvl w:ilvl="0" w:tplc="08090001">
+      <w:start w:val="1"/>
+      <w:numFmt w:val="bullet"/>
+      <w:lvlText w:val=""/>
+      <w:lvlJc w:val="left"/>
+      <w:pPr>
+        <w:ind w:left="360" w:hanging="360"/>
+      </w:pPr>
+      <w:rPr>
+        <w:rFonts w:ascii="Symbol" w:hAnsi="Symbol" w:hint="default"/>
+      </w:rPr>
+    </w:lvl>
+    <w:lvl w:ilvl="1" w:tplc="08090003" w:tentative="1">
+      <w:start w:val="1"/>
+      <w:numFmt w:val="bullet"/>
+      <w:lvlText w:val="o"/>
+      <w:lvlJc w:val="left"/>
+      <w:pPr>
+        <w:ind w:left="1080" w:hanging="360"/>
+      </w:pPr>
+      <w:rPr>
+        <w:rFonts w:ascii="Courier New" w:hAnsi="Courier New" w:cs="Courier New" w:hint="default"/>
+      </w:rPr>
+    </w:lvl>
+    <w:lvl w:ilvl="2" w:tplc="08090005" w:tentative="1">
+      <w:start w:val="1"/>
+      <w:numFmt w:val="bullet"/>
+      <w:lvlText w:val=""/>
+      <w:lvlJc w:val="left"/>
+      <w:pPr>
+        <w:ind w:left="1800" w:hanging="360"/>
+      </w:pPr>
+      <w:rPr>
+        <w:rFonts w:ascii="Wingdings" w:hAnsi="Wingdings" w:hint="default"/>
+      </w:rPr>
+    </w:lvl>
+    <w:lvl w:ilvl="3" w:tplc="08090001" w:tentative="1">
+      <w:start w:val="1"/>
+      <w:numFmt w:val="bullet"/>
+      <w:lvlText w:val=""/>
+      <w:lvlJc w:val="left"/>
+      <w:pPr>
+        <w:ind w:left="2520" w:hanging="360"/>
+      </w:pPr>
+      <w:rPr>
+        <w:rFonts w:ascii="Symbol" w:hAnsi="Symbol" w:hint="default"/>
+      </w:rPr>
+    </w:lvl>
+    <w:lvl w:ilvl="4" w:tplc="08090003" w:tentative="1">
+      <w:start w:val="1"/>
+      <w:numFmt w:val="bullet"/>
+      <w:lvlText w:val="o"/>
+      <w:lvlJc w:val="left"/>
+      <w:pPr>
+        <w:ind w:left="3240" w:hanging="360"/>
+      </w:pPr>
+      <w:rPr>
+        <w:rFonts w:ascii="Courier New" w:hAnsi="Courier New" w:cs="Courier New" w:hint="default"/>
+      </w:rPr>
+    </w:lvl>
+    <w:lvl w:ilvl="5" w:tplc="08090005" w:tentative="1">
+      <w:start w:val="1"/>
+      <w:numFmt w:val="bullet"/>
+      <w:lvlText w:val=""/>
+      <w:lvlJc w:val="left"/>
+      <w:pPr>
+        <w:ind w:left="3960" w:hanging="360"/>
+      </w:pPr>
+      <w:rPr>
+        <w:rFonts w:ascii="Wingdings" w:hAnsi="Wingdings" w:hint="default"/>
+      </w:rPr>
+    </w:lvl>
+    <w:lvl w:ilvl="6" w:tplc="08090001" w:tentative="1">
+      <w:start w:val="1"/>
+      <w:numFmt w:val="bullet"/>
+      <w:lvlText w:val=""/>
+      <w:lvlJc w:val="left"/>
+      <w:pPr>
+        <w:ind w:left="4680" w:hanging="360"/>
+      </w:pPr>
+      <w:rPr>
+        <w:rFonts w:ascii="Symbol" w:hAnsi="Symbol" w:hint="default"/>
+      </w:rPr>
+    </w:lvl>
+    <w:lvl w:ilvl="7" w:tplc="08090003" w:tentative="1">
+      <w:start w:val="1"/>
+      <w:numFmt w:val="bullet"/>
+      <w:lvlText w:val="o"/>
+      <w:lvlJc w:val="left"/>
+      <w:pPr>
+        <w:ind w:left="5400" w:hanging="360"/>
+      </w:pPr>
+      <w:rPr>
+        <w:rFonts w:ascii="Courier New" w:hAnsi="Courier New" w:cs="Courier New" w:hint="default"/>
+      </w:rPr>
+    </w:lvl>
+    <w:lvl w:ilvl="8" w:tplc="08090005" w:tentative="1">
+      <w:start w:val="1"/>
+      <w:numFmt w:val="bullet"/>
+      <w:lvlText w:val=""/>
+      <w:lvlJc w:val="left"/>
+      <w:pPr>
+        <w:ind w:left="6120" w:hanging="360"/>
+      </w:pPr>
+      <w:rPr>
+        <w:rFonts w:ascii="Wingdings" w:hAnsi="Wingdings" w:hint="default"/>
+      </w:rPr>
+    </w:lvl>
+  </w:abstractNum>
+  <w:abstractNum w:abstractNumId="13" w15:restartNumberingAfterBreak="0">
+    <w:nsid w:val="638D6C4D"/>
+    <w:multiLevelType w:val="hybridMultilevel"/>
+    <w:tmpl w:val="16B0BC8E"/>
+    <w:lvl w:ilvl="0" w:tplc="08090001">
+      <w:start w:val="1"/>
+      <w:numFmt w:val="bullet"/>
+      <w:lvlText w:val=""/>
+      <w:lvlJc w:val="left"/>
+      <w:pPr>
+        <w:ind w:left="360" w:hanging="360"/>
+      </w:pPr>
+      <w:rPr>
+        <w:rFonts w:ascii="Symbol" w:hAnsi="Symbol" w:hint="default"/>
+      </w:rPr>
+    </w:lvl>
+    <w:lvl w:ilvl="1" w:tplc="08090003" w:tentative="1">
+      <w:start w:val="1"/>
+      <w:numFmt w:val="bullet"/>
+      <w:lvlText w:val="o"/>
+      <w:lvlJc w:val="left"/>
+      <w:pPr>
+        <w:ind w:left="1080" w:hanging="360"/>
+      </w:pPr>
+      <w:rPr>
+        <w:rFonts w:ascii="Courier New" w:hAnsi="Courier New" w:cs="Courier New" w:hint="default"/>
+      </w:rPr>
+    </w:lvl>
+    <w:lvl w:ilvl="2" w:tplc="08090005" w:tentative="1">
+      <w:start w:val="1"/>
+      <w:numFmt w:val="bullet"/>
+      <w:lvlText w:val=""/>
+      <w:lvlJc w:val="left"/>
+      <w:pPr>
+        <w:ind w:left="1800" w:hanging="360"/>
+      </w:pPr>
+      <w:rPr>
+        <w:rFonts w:ascii="Wingdings" w:hAnsi="Wingdings" w:hint="default"/>
+      </w:rPr>
+    </w:lvl>
+    <w:lvl w:ilvl="3" w:tplc="08090001" w:tentative="1">
+      <w:start w:val="1"/>
+      <w:numFmt w:val="bullet"/>
+      <w:lvlText w:val=""/>
+      <w:lvlJc w:val="left"/>
+      <w:pPr>
+        <w:ind w:left="2520" w:hanging="360"/>
+      </w:pPr>
+      <w:rPr>
+        <w:rFonts w:ascii="Symbol" w:hAnsi="Symbol" w:hint="default"/>
+      </w:rPr>
+    </w:lvl>
+    <w:lvl w:ilvl="4" w:tplc="08090003" w:tentative="1">
+      <w:start w:val="1"/>
+      <w:numFmt w:val="bullet"/>
+      <w:lvlText w:val="o"/>
+      <w:lvlJc w:val="left"/>
+      <w:pPr>
+        <w:ind w:left="3240" w:hanging="360"/>
+      </w:pPr>
+      <w:rPr>
+        <w:rFonts w:ascii="Courier New" w:hAnsi="Courier New" w:cs="Courier New" w:hint="default"/>
+      </w:rPr>
+    </w:lvl>
+    <w:lvl w:ilvl="5" w:tplc="08090005" w:tentative="1">
+      <w:start w:val="1"/>
+      <w:numFmt w:val="bullet"/>
+      <w:lvlText w:val=""/>
+      <w:lvlJc w:val="left"/>
+      <w:pPr>
+        <w:ind w:left="3960" w:hanging="360"/>
+      </w:pPr>
+      <w:rPr>
+        <w:rFonts w:ascii="Wingdings" w:hAnsi="Wingdings" w:hint="default"/>
+      </w:rPr>
+    </w:lvl>
+    <w:lvl w:ilvl="6" w:tplc="08090001" w:tentative="1">
+      <w:start w:val="1"/>
+      <w:numFmt w:val="bullet"/>
+      <w:lvlText w:val=""/>
+      <w:lvlJc w:val="left"/>
+      <w:pPr>
+        <w:ind w:left="4680" w:hanging="360"/>
+      </w:pPr>
+      <w:rPr>
+        <w:rFonts w:ascii="Symbol" w:hAnsi="Symbol" w:hint="default"/>
+      </w:rPr>
+    </w:lvl>
+    <w:lvl w:ilvl="7" w:tplc="08090003" w:tentative="1">
+      <w:start w:val="1"/>
+      <w:numFmt w:val="bullet"/>
+      <w:lvlText w:val="o"/>
+      <w:lvlJc w:val="left"/>
+      <w:pPr>
+        <w:ind w:left="5400" w:hanging="360"/>
+      </w:pPr>
+      <w:rPr>
+        <w:rFonts w:ascii="Courier New" w:hAnsi="Courier New" w:cs="Courier New" w:hint="default"/>
+      </w:rPr>
+    </w:lvl>
+    <w:lvl w:ilvl="8" w:tplc="08090005" w:tentative="1">
+      <w:start w:val="1"/>
+      <w:numFmt w:val="bullet"/>
+      <w:lvlText w:val=""/>
+      <w:lvlJc w:val="left"/>
+      <w:pPr>
+        <w:ind w:left="6120" w:hanging="360"/>
+      </w:pPr>
+      <w:rPr>
+        <w:rFonts w:ascii="Wingdings" w:hAnsi="Wingdings" w:hint="default"/>
+      </w:rPr>
+    </w:lvl>
+  </w:abstractNum>
+  <w:abstractNum w:abstractNumId="14" w15:restartNumberingAfterBreak="0">
+    <w:nsid w:val="6E89493E"/>
+    <w:multiLevelType w:val="hybridMultilevel"/>
+    <w:tmpl w:val="27D81144"/>
+    <w:lvl w:ilvl="0" w:tplc="08090001">
+      <w:start w:val="1"/>
+      <w:numFmt w:val="bullet"/>
+      <w:lvlText w:val=""/>
+      <w:lvlJc w:val="left"/>
+      <w:pPr>
+        <w:ind w:left="360" w:hanging="360"/>
+      </w:pPr>
+      <w:rPr>
+        <w:rFonts w:ascii="Symbol" w:hAnsi="Symbol" w:hint="default"/>
+      </w:rPr>
+    </w:lvl>
+    <w:lvl w:ilvl="1" w:tplc="08090003" w:tentative="1">
+      <w:start w:val="1"/>
+      <w:numFmt w:val="bullet"/>
+      <w:lvlText w:val="o"/>
+      <w:lvlJc w:val="left"/>
+      <w:pPr>
+        <w:ind w:left="1080" w:hanging="360"/>
+      </w:pPr>
+      <w:rPr>
+        <w:rFonts w:ascii="Courier New" w:hAnsi="Courier New" w:cs="Courier New" w:hint="default"/>
+      </w:rPr>
+    </w:lvl>
+    <w:lvl w:ilvl="2" w:tplc="08090005" w:tentative="1">
+      <w:start w:val="1"/>
+      <w:numFmt w:val="bullet"/>
+      <w:lvlText w:val=""/>
+      <w:lvlJc w:val="left"/>
+      <w:pPr>
+        <w:ind w:left="1800" w:hanging="360"/>
+      </w:pPr>
+      <w:rPr>
+        <w:rFonts w:ascii="Wingdings" w:hAnsi="Wingdings" w:hint="default"/>
+      </w:rPr>
+    </w:lvl>
+    <w:lvl w:ilvl="3" w:tplc="08090001" w:tentative="1">
+      <w:start w:val="1"/>
+      <w:numFmt w:val="bullet"/>
+      <w:lvlText w:val=""/>
+      <w:lvlJc w:val="left"/>
+      <w:pPr>
+        <w:ind w:left="2520" w:hanging="360"/>
+      </w:pPr>
+      <w:rPr>
+        <w:rFonts w:ascii="Symbol" w:hAnsi="Symbol" w:hint="default"/>
+      </w:rPr>
+    </w:lvl>
+    <w:lvl w:ilvl="4" w:tplc="08090003" w:tentative="1">
+      <w:start w:val="1"/>
+      <w:numFmt w:val="bullet"/>
+      <w:lvlText w:val="o"/>
+      <w:lvlJc w:val="left"/>
+      <w:pPr>
+        <w:ind w:left="3240" w:hanging="360"/>
+      </w:pPr>
+      <w:rPr>
+        <w:rFonts w:ascii="Courier New" w:hAnsi="Courier New" w:cs="Courier New" w:hint="default"/>
+      </w:rPr>
+    </w:lvl>
+    <w:lvl w:ilvl="5" w:tplc="08090005" w:tentative="1">
+      <w:start w:val="1"/>
+      <w:numFmt w:val="bullet"/>
+      <w:lvlText w:val=""/>
+      <w:lvlJc w:val="left"/>
+      <w:pPr>
+        <w:ind w:left="3960" w:hanging="360"/>
+      </w:pPr>
+      <w:rPr>
+        <w:rFonts w:ascii="Wingdings" w:hAnsi="Wingdings" w:hint="default"/>
+      </w:rPr>
+    </w:lvl>
+    <w:lvl w:ilvl="6" w:tplc="08090001" w:tentative="1">
+      <w:start w:val="1"/>
+      <w:numFmt w:val="bullet"/>
+      <w:lvlText w:val=""/>
+      <w:lvlJc w:val="left"/>
+      <w:pPr>
+        <w:ind w:left="4680" w:hanging="360"/>
+      </w:pPr>
+      <w:rPr>
+        <w:rFonts w:ascii="Symbol" w:hAnsi="Symbol" w:hint="default"/>
+      </w:rPr>
+    </w:lvl>
+    <w:lvl w:ilvl="7" w:tplc="08090003" w:tentative="1">
+      <w:start w:val="1"/>
+      <w:numFmt w:val="bullet"/>
+      <w:lvlText w:val="o"/>
+      <w:lvlJc w:val="left"/>
+      <w:pPr>
+        <w:ind w:left="5400" w:hanging="360"/>
+      </w:pPr>
+      <w:rPr>
+        <w:rFonts w:ascii="Courier New" w:hAnsi="Courier New" w:cs="Courier New" w:hint="default"/>
+      </w:rPr>
+    </w:lvl>
+    <w:lvl w:ilvl="8" w:tplc="08090005" w:tentative="1">
+      <w:start w:val="1"/>
+      <w:numFmt w:val="bullet"/>
+      <w:lvlText w:val=""/>
+      <w:lvlJc w:val="left"/>
+      <w:pPr>
+        <w:ind w:left="6120" w:hanging="360"/>
+      </w:pPr>
+      <w:rPr>
+        <w:rFonts w:ascii="Wingdings" w:hAnsi="Wingdings" w:hint="default"/>
+      </w:rPr>
+    </w:lvl>
+  </w:abstractNum>
+  <w:num w:numId="1" w16cid:durableId="1203254222">
+    <w:abstractNumId w:val="4"/>
+  </w:num>
+  <w:num w:numId="2" w16cid:durableId="1390572259">
+    <w:abstractNumId w:val="10"/>
+  </w:num>
+  <w:num w:numId="3" w16cid:durableId="1143431024">
+    <w:abstractNumId w:val="3"/>
+  </w:num>
+  <w:num w:numId="4" w16cid:durableId="34083021">
+    <w:abstractNumId w:val="11"/>
+  </w:num>
+  <w:num w:numId="5" w16cid:durableId="2021155766">
+    <w:abstractNumId w:val="6"/>
+  </w:num>
+  <w:num w:numId="6" w16cid:durableId="1806660350">
+    <w:abstractNumId w:val="12"/>
+  </w:num>
+  <w:num w:numId="7" w16cid:durableId="550461827">
+    <w:abstractNumId w:val="9"/>
+  </w:num>
+  <w:num w:numId="8" w16cid:durableId="225535423">
+    <w:abstractNumId w:val="2"/>
+  </w:num>
+  <w:num w:numId="9" w16cid:durableId="1990399342">
+    <w:abstractNumId w:val="13"/>
+  </w:num>
+  <w:num w:numId="10" w16cid:durableId="397747446">
+    <w:abstractNumId w:val="7"/>
+  </w:num>
+  <w:num w:numId="11" w16cid:durableId="1622375722">
+    <w:abstractNumId w:val="5"/>
+  </w:num>
+  <w:num w:numId="12" w16cid:durableId="781876294">
+    <w:abstractNumId w:val="14"/>
+  </w:num>
+  <w:num w:numId="13" w16cid:durableId="149905604">
+    <w:abstractNumId w:val="0"/>
+  </w:num>
+  <w:num w:numId="14" w16cid:durableId="1383821019">
+    <w:abstractNumId w:val="1"/>
+  </w:num>
+  <w:num w:numId="15" w16cid:durableId="1399209875">
+    <w:abstractNumId w:val="8"/>
+  </w:num>
+</w:numbering>
 </file>
 
 <file path=word/styles.xml><?xml version="1.0" encoding="utf-8"?>

</xml_diff>

<commit_message>
prioritise high features PlCl
</commit_message>
<xml_diff>
--- a/Report.docx
+++ b/Report.docx
@@ -1235,23 +1235,20 @@
     </w:p>
     <w:p>
       <w:r>
-        <w:rPr>
-          <w:noProof/>
-        </w:rPr>
         <w:lastRenderedPageBreak/>
         <w:drawing>
-          <wp:anchor distT="0" distB="0" distL="114300" distR="114300" simplePos="0" relativeHeight="251660288" behindDoc="0" locked="0" layoutInCell="1" allowOverlap="1" wp14:anchorId="67F30EC4" wp14:editId="18ECE367">
+          <wp:anchor distT="0" distB="0" distL="114300" distR="114300" simplePos="0" relativeHeight="251665408" behindDoc="0" locked="0" layoutInCell="1" allowOverlap="1" wp14:anchorId="437EF1E2" wp14:editId="192B330D">
             <wp:simplePos x="0" y="0"/>
             <wp:positionH relativeFrom="margin">
-              <wp:align>right</wp:align>
+              <wp:posOffset>3380740</wp:posOffset>
             </wp:positionH>
             <wp:positionV relativeFrom="paragraph">
-              <wp:posOffset>9525</wp:posOffset>
+              <wp:posOffset>0</wp:posOffset>
             </wp:positionV>
-            <wp:extent cx="2329815" cy="1866265"/>
-            <wp:effectExtent l="0" t="0" r="0" b="635"/>
+            <wp:extent cx="2341880" cy="2004060"/>
+            <wp:effectExtent l="0" t="0" r="1270" b="0"/>
             <wp:wrapSquare wrapText="bothSides"/>
-            <wp:docPr id="1658356775" name="Picture 1"/>
+            <wp:docPr id="1447165698" name="Picture 1"/>
             <wp:cNvGraphicFramePr>
               <a:graphicFrameLocks xmlns:a="http://schemas.openxmlformats.org/drawingml/2006/main" noChangeAspect="1"/>
             </wp:cNvGraphicFramePr>
@@ -1259,7 +1256,7 @@
               <a:graphicData uri="http://schemas.openxmlformats.org/drawingml/2006/picture">
                 <pic:pic xmlns:pic="http://schemas.openxmlformats.org/drawingml/2006/picture">
                   <pic:nvPicPr>
-                    <pic:cNvPr id="1658356775" name=""/>
+                    <pic:cNvPr id="1447165698" name=""/>
                     <pic:cNvPicPr/>
                   </pic:nvPicPr>
                   <pic:blipFill>
@@ -1277,7 +1274,7 @@
                   <pic:spPr>
                     <a:xfrm>
                       <a:off x="0" y="0"/>
-                      <a:ext cx="2329815" cy="1866265"/>
+                      <a:ext cx="2341880" cy="2004060"/>
                     </a:xfrm>
                     <a:prstGeom prst="rect">
                       <a:avLst/>
@@ -1335,22 +1332,19 @@
         </w:rPr>
       </w:pPr>
       <w:r>
-        <w:rPr>
-          <w:noProof/>
-        </w:rPr>
         <w:drawing>
-          <wp:anchor distT="0" distB="0" distL="114300" distR="114300" simplePos="0" relativeHeight="251661312" behindDoc="0" locked="0" layoutInCell="1" allowOverlap="1" wp14:anchorId="4F5200DE" wp14:editId="4309CACC">
+          <wp:anchor distT="0" distB="0" distL="114300" distR="114300" simplePos="0" relativeHeight="251664384" behindDoc="0" locked="0" layoutInCell="1" allowOverlap="1" wp14:anchorId="5F89D7F9" wp14:editId="507C5A10">
             <wp:simplePos x="0" y="0"/>
             <wp:positionH relativeFrom="margin">
-              <wp:align>right</wp:align>
+              <wp:posOffset>3457575</wp:posOffset>
             </wp:positionH>
             <wp:positionV relativeFrom="paragraph">
-              <wp:posOffset>20955</wp:posOffset>
+              <wp:posOffset>5080</wp:posOffset>
             </wp:positionV>
-            <wp:extent cx="2660015" cy="1971675"/>
-            <wp:effectExtent l="0" t="0" r="6985" b="9525"/>
+            <wp:extent cx="2269490" cy="1653540"/>
+            <wp:effectExtent l="0" t="0" r="0" b="3810"/>
             <wp:wrapSquare wrapText="bothSides"/>
-            <wp:docPr id="1242982508" name="Picture 1"/>
+            <wp:docPr id="324243307" name="Picture 1"/>
             <wp:cNvGraphicFramePr>
               <a:graphicFrameLocks xmlns:a="http://schemas.openxmlformats.org/drawingml/2006/main" noChangeAspect="1"/>
             </wp:cNvGraphicFramePr>
@@ -1358,7 +1352,7 @@
               <a:graphicData uri="http://schemas.openxmlformats.org/drawingml/2006/picture">
                 <pic:pic xmlns:pic="http://schemas.openxmlformats.org/drawingml/2006/picture">
                   <pic:nvPicPr>
-                    <pic:cNvPr id="1242982508" name=""/>
+                    <pic:cNvPr id="324243307" name=""/>
                     <pic:cNvPicPr/>
                   </pic:nvPicPr>
                   <pic:blipFill>
@@ -1376,7 +1370,7 @@
                   <pic:spPr>
                     <a:xfrm>
                       <a:off x="0" y="0"/>
-                      <a:ext cx="2660015" cy="1971675"/>
+                      <a:ext cx="2269490" cy="1653540"/>
                     </a:xfrm>
                     <a:prstGeom prst="rect">
                       <a:avLst/>
@@ -1465,11 +1459,11 @@
         <w:t xml:space="preserve">Header and Upload Requests: </w:t>
       </w:r>
       <w:r>
-        <w:t xml:space="preserve">When a replay file is uploaded, the system sends two asynchronous requests to the backend simultaneously: a header request, which extracts basic details such as the player list, replay name, game mode, and date (falling back to the map name via map code if the replay name is empty), and a full parse request. Since the header request is near-instant, each replay appears in the list immediately while parsing continues in the background, keeping the interface </w:t>
+        <w:t xml:space="preserve">When a replay file is uploaded, the system sends two asynchronous requests to the backend simultaneously: a header request, which extracts basic details such as the player list, replay name, game mode, and date (falling back to the map name via map code if the replay name is empty), and a full parse request. Since the header request is near-instant, each replay appears in the list immediately while parsing continues in the background, keeping the interface responsive and allowing the user to continue uploading. Although the header and full parse requests </w:t>
       </w:r>
       <w:r>
         <w:lastRenderedPageBreak/>
-        <w:t>responsive and allowing the user to continue uploading. Although the header and full parse requests are asynchronous to each other, full parse requests are processed synchronously among themselves — experimentation showed no difference in total parsing time, and this approach allows the loading bar to accurately reflect progress based on the number of replays parsed out of the total.</w:t>
+        <w:t>are asynchronous to each other, full parse requests are processed synchronously among themselves — experimentation showed no difference in total parsing time, and this approach allows the loading bar to accurately reflect progress based on the number of replays parsed out of the total.</w:t>
       </w:r>
     </w:p>
     <w:p>
@@ -1493,15 +1487,7 @@
         <w:t xml:space="preserve">Ballchasing Upload: </w:t>
       </w:r>
       <w:r>
-        <w:t xml:space="preserve">The Ballchasing.com upload method was added late in implementation, primarily to address unexpectedly slow parser performance on the hosted server, and additionally to improve consistency with the large pre-computed dataset, which was also built using the Ballchasing.com API and therefore the same parser. It is also worth noting that many players have replays on Ballchasing.com without their knowledge, as others can upload </w:t>
-      </w:r>
-      <w:proofErr w:type="gramStart"/>
-      <w:r>
-        <w:t>games</w:t>
-      </w:r>
-      <w:proofErr w:type="gramEnd"/>
-      <w:r>
-        <w:t xml:space="preserve"> they were present in — as an example, I personally have over 2000 replays on Ballchasing.com without having uploaded a single one, making this upload method more broadly useful than it may initially seem.</w:t>
+        <w:t>The Ballchasing.com upload method was added late in implementation, primarily to address unexpectedly slow parser performance on the hosted server, and additionally to improve consistency with the large pre-computed dataset, which was also built using the Ballchasing.com API and therefore the same parser. It is also worth noting that many players have replays on Ballchasing.com without their knowledge, as others can upload games they were present in — as an example, I personally have over 2000 replays on Ballchasing.com without having uploaded a single one, making this upload method more broadly useful than it may initially seem.</w:t>
       </w:r>
       <w:r>
         <w:t xml:space="preserve"> Another important aspect of this feature is the way it was integrated late into the implementation </w:t>
@@ -1562,11 +1548,11 @@
         <w:t>;</w:t>
       </w:r>
       <w:r>
-        <w:t xml:space="preserve"> average speed is converted to a percentage of the maximum possible speed rather than an </w:t>
+        <w:t xml:space="preserve"> average speed is converted to a percentage of the maximum possible speed rather than an arbitrary raw value, and total boost consumption is divided by game duration to give a per-minute </w:t>
       </w:r>
       <w:r>
         <w:lastRenderedPageBreak/>
-        <w:t>arbitrary raw value, and total boost consumption is divided by game duration to give a per-minute figure more familiar to players. The Possession category is conditionally hidden when Ballchasing-uploaded data is detected</w:t>
+        <w:t>figure more familiar to players. The Possession category is conditionally hidden when Ballchasing-uploaded data is detected</w:t>
       </w:r>
       <w:r>
         <w:t xml:space="preserve"> through a “ballchasing” field in the data</w:t>
@@ -1674,17 +1660,35 @@
           <w:b/>
           <w:bCs/>
         </w:rPr>
+        <w:t xml:space="preserve">Model Sureness and Feature Importance: </w:t>
+      </w:r>
+      <w:r>
+        <w:t>Model confidence is derived naturally from the Random Forest's 300 trees</w:t>
+      </w:r>
+      <w:r>
+        <w:t xml:space="preserve"> as</w:t>
+      </w:r>
+      <w:r>
+        <w:t xml:space="preserve"> the proportion of trees voting for each playstyle gives a probability distribution </w:t>
+      </w:r>
+      <w:r>
         <w:lastRenderedPageBreak/>
-        <w:t xml:space="preserve">Model Sureness and Feature Importance: </w:t>
-      </w:r>
-      <w:r>
-        <w:t>Model confidence is derived naturally from the Random Forest's 300 trees</w:t>
-      </w:r>
-      <w:r>
-        <w:t xml:space="preserve"> as</w:t>
-      </w:r>
-      <w:r>
-        <w:t xml:space="preserve"> the proportion of trees voting for each playstyle gives a probability distribution across all playstyles, producing the informative mix shown in the "Other playstyles" section. Feature importance is computed using a SHAP TreeExplainer, which measures each feature's contribution specifically to the user's prediction. Only features with a positive SHAP contribution are shown, as negative values indicate a feature pushing against the classification and would be misleading to present as a reason for it. Each feature's contribution is expressed as a percentage of the total positive SHAP mass rather than the raw value, so the user can understand the relative significance between features at a glance. The percentile value is displayed alongside each feature for context, with the underlying raw value visible in the Rank Comparison section.</w:t>
+        <w:t>across all playstyles, producing the informative mix shown in the "Other playstyles" section. Feature importance is computed using a SHAP TreeExplainer, which measures each feature's contribution specifically to the user's prediction. Only features with a positive SHAP contribution are shown, as negative values indicate a feature pushing against the classification and would be misleading to present as a reason for it. Each feature's contribution is expressed as a percentage of the total positive SHAP mass rather than the raw value, so the user can understand the relative significance between features at a glance.</w:t>
+      </w:r>
+      <w:r>
+        <w:t xml:space="preserve"> </w:t>
+      </w:r>
+      <w:r>
+        <w:t xml:space="preserve">High-direction features are prioritised as they directly support the classification, with any remaining slots from the top </w:t>
+      </w:r>
+      <w:r>
+        <w:t>5</w:t>
+      </w:r>
+      <w:r>
+        <w:t xml:space="preserve"> filled by low-direction features if insufficient high-direction ones exist.</w:t>
+      </w:r>
+      <w:r>
+        <w:t xml:space="preserve"> The percentile value is displayed alongside each feature for context, with the underlying raw value visible in the Rank Comparison section.</w:t>
       </w:r>
     </w:p>
     <w:p>

</xml_diff>

<commit_message>
made unit test structure
</commit_message>
<xml_diff>
--- a/Report.docx
+++ b/Report.docx
@@ -1060,7 +1060,7 @@
           <w:noProof/>
         </w:rPr>
         <w:drawing>
-          <wp:anchor distT="0" distB="0" distL="114300" distR="114300" simplePos="0" relativeHeight="251658240" behindDoc="0" locked="0" layoutInCell="1" allowOverlap="1" wp14:anchorId="4A22E329" wp14:editId="52DCA07D">
+          <wp:anchor distT="0" distB="0" distL="114300" distR="114300" simplePos="0" relativeHeight="251658240" behindDoc="0" locked="0" layoutInCell="1" allowOverlap="1" wp14:anchorId="4A22E329" wp14:editId="365AEE04">
             <wp:simplePos x="0" y="0"/>
             <wp:positionH relativeFrom="margin">
               <wp:align>right</wp:align>
@@ -1235,9 +1235,12 @@
     </w:p>
     <w:p>
       <w:r>
+        <w:rPr>
+          <w:noProof/>
+        </w:rPr>
         <w:lastRenderedPageBreak/>
         <w:drawing>
-          <wp:anchor distT="0" distB="0" distL="114300" distR="114300" simplePos="0" relativeHeight="251665408" behindDoc="0" locked="0" layoutInCell="1" allowOverlap="1" wp14:anchorId="437EF1E2" wp14:editId="192B330D">
+          <wp:anchor distT="0" distB="0" distL="114300" distR="114300" simplePos="0" relativeHeight="251665408" behindDoc="0" locked="0" layoutInCell="1" allowOverlap="1" wp14:anchorId="437EF1E2" wp14:editId="0C35D0CA">
             <wp:simplePos x="0" y="0"/>
             <wp:positionH relativeFrom="margin">
               <wp:posOffset>3380740</wp:posOffset>
@@ -1332,6 +1335,9 @@
         </w:rPr>
       </w:pPr>
       <w:r>
+        <w:rPr>
+          <w:noProof/>
+        </w:rPr>
         <w:drawing>
           <wp:anchor distT="0" distB="0" distL="114300" distR="114300" simplePos="0" relativeHeight="251664384" behindDoc="0" locked="0" layoutInCell="1" allowOverlap="1" wp14:anchorId="5F89D7F9" wp14:editId="507C5A10">
             <wp:simplePos x="0" y="0"/>
@@ -2692,7 +2698,6 @@
         <w:t xml:space="preserve"> handle replay duration differently. Carball tracks statistics only during active play, whereas the Ballchasing parser includes kickoff countdowns and goal celebrations, which pads certain statistics in ways that are difficult to account for precisely. A side-by-side comparison of the same replay processed through both methods is included in Appendix F.14. The resulting playstyle classification was identical across both, though with differing confidence values, indicating that despite the parser differences the system produces consistent classifications regardless of upload method.</w:t>
       </w:r>
     </w:p>
-    <w:p/>
     <w:p>
       <w:pPr>
         <w:rPr>

</xml_diff>